<commit_message>
docs: añadir sección marcos complementarios en FAQ
- Sección nueva: Marcos Complementarios - Cobertura Global
- RGPD, Directiva Copyright, ISO 42001, ISO 38507, ISO 23894
- OECD AI Principles, ICO UK Guidance, IEEE EAD
- Ventaja competitiva: cumplimiento multi-jurisdiccional
- Total: 6 frameworks integrados

Posicionamiento: CodeflowX no solo EU AI Act, sino compliance global
</commit_message>
<xml_diff>
--- a/docs/lanzamiento/FAQ_CUANDO_TE_AFECTA_AI_ACT.docx
+++ b/docs/lanzamiento/FAQ_CUANDO_TE_AFECTA_AI_ACT.docx
@@ -2,7 +2,7 @@
 <file path=word/document.xml><?xml version="1.0" encoding="utf-8"?>
 <w:document xmlns:w="http://schemas.openxmlformats.org/wordprocessingml/2006/main" xmlns:m="http://schemas.openxmlformats.org/officeDocument/2006/math" xmlns:r="http://schemas.openxmlformats.org/officeDocument/2006/relationships" xmlns:o="urn:schemas-microsoft-com:office:office" xmlns:v="urn:schemas-microsoft-com:vml" xmlns:w10="urn:schemas-microsoft-com:office:word" xmlns:a="http://schemas.openxmlformats.org/drawingml/2006/main" xmlns:pic="http://schemas.openxmlformats.org/drawingml/2006/picture" xmlns:wp="http://schemas.openxmlformats.org/drawingml/2006/wordprocessingDrawing">
   <w:body>
-    <w:bookmarkStart w:id="43" w:name="me-afecta-el-eu-ai-act---faq-técnico"/>
+    <w:bookmarkStart w:id="47" w:name="me-afecta-el-eu-ai-act---faq-técnico"/>
     <w:p>
       <w:pPr>
         <w:pStyle w:val="Heading1"/>
@@ -1119,16 +1119,28 @@
       </w:r>
     </w:p>
     <w:bookmarkEnd w:id="21"/>
-    <w:bookmarkStart w:id="32" w:name="faq-detallado---respuestas-directas"/>
+    <w:bookmarkStart w:id="25" w:name="X8c8139912a1feb453a0d9c64138349eae2352dd"/>
     <w:p>
       <w:pPr>
         <w:pStyle w:val="Heading2"/>
       </w:pPr>
       <w:r>
-        <w:t xml:space="preserve">📋 FAQ DETALLADO - RESPUESTAS DIRECTAS</w:t>
-      </w:r>
-    </w:p>
-    <w:bookmarkStart w:id="22" w:name="X1e807e84cf7ec42aca6a8d5da90c7fef67cf335"/>
+        <w:t xml:space="preserve">🌍 MARCOS COMPLEMENTARIOS - COBERTURA GLOBAL</w:t>
+      </w:r>
+    </w:p>
+    <w:p>
+      <w:pPr>
+        <w:pStyle w:val="FirstParagraph"/>
+      </w:pPr>
+      <w:r>
+        <w:rPr>
+          <w:bCs/>
+          <w:b/>
+        </w:rPr>
+        <w:t xml:space="preserve">CodeflowX no solo cubre EU AI Act, también implementa:</w:t>
+      </w:r>
+    </w:p>
+    <w:bookmarkStart w:id="22" w:name="normativa-europea"/>
     <w:p>
       <w:pPr>
         <w:pStyle w:val="Heading3"/>
@@ -1138,7 +1150,211 @@
           <w:bCs/>
           <w:b/>
         </w:rPr>
-        <w:t xml:space="preserve">P1: ¿Si uso adapters (LoRA) soy proveedor GPAI?</w:t>
+        <w:t xml:space="preserve">Normativa Europea</w:t>
+      </w:r>
+    </w:p>
+    <w:p>
+      <w:pPr>
+        <w:numPr>
+          <w:ilvl w:val="0"/>
+          <w:numId w:val="1001"/>
+        </w:numPr>
+        <w:pStyle w:val="Compact"/>
+      </w:pPr>
+      <w:r>
+        <w:rPr>
+          <w:bCs/>
+          <w:b/>
+        </w:rPr>
+        <w:t xml:space="preserve">RGPD (2016/679):</w:t>
+      </w:r>
+      <w:r>
+        <w:t xml:space="preserve"> </w:t>
+      </w:r>
+      <w:r>
+        <w:t xml:space="preserve">Integración completa protección datos personales</w:t>
+      </w:r>
+    </w:p>
+    <w:p>
+      <w:pPr>
+        <w:numPr>
+          <w:ilvl w:val="0"/>
+          <w:numId w:val="1001"/>
+        </w:numPr>
+        <w:pStyle w:val="Compact"/>
+      </w:pPr>
+      <w:r>
+        <w:rPr>
+          <w:bCs/>
+          <w:b/>
+        </w:rPr>
+        <w:t xml:space="preserve">Directiva Copyright (2019/790):</w:t>
+      </w:r>
+      <w:r>
+        <w:t xml:space="preserve"> </w:t>
+      </w:r>
+      <w:r>
+        <w:t xml:space="preserve">Art. 53.1.c GPAI (Text and Data Mining)</w:t>
+      </w:r>
+    </w:p>
+    <w:bookmarkEnd w:id="22"/>
+    <w:bookmarkStart w:id="23" w:name="estándares-internacionales-iso"/>
+    <w:p>
+      <w:pPr>
+        <w:pStyle w:val="Heading3"/>
+      </w:pPr>
+      <w:r>
+        <w:rPr>
+          <w:bCs/>
+          <w:b/>
+        </w:rPr>
+        <w:t xml:space="preserve">Estándares Internacionales ISO</w:t>
+      </w:r>
+    </w:p>
+    <w:p>
+      <w:pPr>
+        <w:numPr>
+          <w:ilvl w:val="0"/>
+          <w:numId w:val="1002"/>
+        </w:numPr>
+        <w:pStyle w:val="Compact"/>
+      </w:pPr>
+      <w:r>
+        <w:rPr>
+          <w:bCs/>
+          <w:b/>
+        </w:rPr>
+        <w:t xml:space="preserve">ISO/IEC 42001:2023:</w:t>
+      </w:r>
+      <w:r>
+        <w:t xml:space="preserve"> </w:t>
+      </w:r>
+      <w:r>
+        <w:t xml:space="preserve">Sistema de gestión de IA (certificable)</w:t>
+      </w:r>
+    </w:p>
+    <w:p>
+      <w:pPr>
+        <w:numPr>
+          <w:ilvl w:val="0"/>
+          <w:numId w:val="1002"/>
+        </w:numPr>
+        <w:pStyle w:val="Compact"/>
+      </w:pPr>
+      <w:r>
+        <w:rPr>
+          <w:bCs/>
+          <w:b/>
+        </w:rPr>
+        <w:t xml:space="preserve">ISO/IEC 38507:2022:</w:t>
+      </w:r>
+      <w:r>
+        <w:t xml:space="preserve"> </w:t>
+      </w:r>
+      <w:r>
+        <w:t xml:space="preserve">Gobernanza de TI para uso de IA en organizaciones</w:t>
+      </w:r>
+    </w:p>
+    <w:p>
+      <w:pPr>
+        <w:numPr>
+          <w:ilvl w:val="0"/>
+          <w:numId w:val="1002"/>
+        </w:numPr>
+        <w:pStyle w:val="Compact"/>
+      </w:pPr>
+      <w:r>
+        <w:rPr>
+          <w:bCs/>
+          <w:b/>
+        </w:rPr>
+        <w:t xml:space="preserve">ISO/IEC 23894:2023:</w:t>
+      </w:r>
+      <w:r>
+        <w:t xml:space="preserve"> </w:t>
+      </w:r>
+      <w:r>
+        <w:t xml:space="preserve">Gestión de riesgos de IA (marco técnico)</w:t>
+      </w:r>
+    </w:p>
+    <w:bookmarkEnd w:id="23"/>
+    <w:bookmarkStart w:id="24" w:name="marcos-de-referencia-globales"/>
+    <w:p>
+      <w:pPr>
+        <w:pStyle w:val="Heading3"/>
+      </w:pPr>
+      <w:r>
+        <w:rPr>
+          <w:bCs/>
+          <w:b/>
+        </w:rPr>
+        <w:t xml:space="preserve">Marcos de Referencia Globales</w:t>
+      </w:r>
+    </w:p>
+    <w:p>
+      <w:pPr>
+        <w:numPr>
+          <w:ilvl w:val="0"/>
+          <w:numId w:val="1003"/>
+        </w:numPr>
+        <w:pStyle w:val="Compact"/>
+      </w:pPr>
+      <w:r>
+        <w:rPr>
+          <w:bCs/>
+          <w:b/>
+        </w:rPr>
+        <w:t xml:space="preserve">OECD AI Principles:</w:t>
+      </w:r>
+      <w:r>
+        <w:t xml:space="preserve"> </w:t>
+      </w:r>
+      <w:r>
+        <w:t xml:space="preserve">Principios adoptados por 50+ países (IA confiable, ética)</w:t>
+      </w:r>
+    </w:p>
+    <w:p>
+      <w:pPr>
+        <w:numPr>
+          <w:ilvl w:val="0"/>
+          <w:numId w:val="1003"/>
+        </w:numPr>
+        <w:pStyle w:val="Compact"/>
+      </w:pPr>
+      <w:r>
+        <w:rPr>
+          <w:bCs/>
+          <w:b/>
+        </w:rPr>
+        <w:t xml:space="preserve">ICO UK Guidance:</w:t>
+      </w:r>
+      <w:r>
+        <w:t xml:space="preserve"> </w:t>
+      </w:r>
+      <w:r>
+        <w:t xml:space="preserve">Transparencia y accountability en IA (Reino Unido)</w:t>
+      </w:r>
+    </w:p>
+    <w:p>
+      <w:pPr>
+        <w:numPr>
+          <w:ilvl w:val="0"/>
+          <w:numId w:val="1003"/>
+        </w:numPr>
+        <w:pStyle w:val="Compact"/>
+      </w:pPr>
+      <w:r>
+        <w:rPr>
+          <w:bCs/>
+          <w:b/>
+        </w:rPr>
+        <w:t xml:space="preserve">IEEE Ethically Aligned Design (EAD):</w:t>
+      </w:r>
+      <w:r>
+        <w:t xml:space="preserve"> </w:t>
+      </w:r>
+      <w:r>
+        <w:t xml:space="preserve">Diseño IA alineado con valores humanos</w:t>
       </w:r>
     </w:p>
     <w:p>
@@ -1146,17 +1362,33 @@
         <w:pStyle w:val="FirstParagraph"/>
       </w:pPr>
       <w:r>
-        <w:t xml:space="preserve">✅</w:t>
-      </w:r>
-      <w:r>
-        <w:t xml:space="preserve"> </w:t>
-      </w:r>
-      <w:r>
-        <w:rPr>
-          <w:bCs/>
-          <w:b/>
-        </w:rPr>
-        <w:t xml:space="preserve">SÍ, probablemente eres proveedor GPAI.</w:t>
+        <w:rPr>
+          <w:bCs/>
+          <w:b/>
+        </w:rPr>
+        <w:t xml:space="preserve">Total:</w:t>
+      </w:r>
+      <w:r>
+        <w:t xml:space="preserve"> </w:t>
+      </w:r>
+      <w:r>
+        <w:t xml:space="preserve">CodeflowX implementa</w:t>
+      </w:r>
+      <w:r>
+        <w:t xml:space="preserve"> </w:t>
+      </w:r>
+      <w:r>
+        <w:rPr>
+          <w:bCs/>
+          <w:b/>
+        </w:rPr>
+        <w:t xml:space="preserve">6 frameworks de cumplimiento integrados</w:t>
+      </w:r>
+      <w:r>
+        <w:t xml:space="preserve"> </w:t>
+      </w:r>
+      <w:r>
+        <w:t xml:space="preserve">(no como herramientas separadas)</w:t>
       </w:r>
     </w:p>
     <w:p>
@@ -1168,155 +1400,13 @@
           <w:bCs/>
           <w:b/>
         </w:rPr>
-        <w:t xml:space="preserve">Razonamiento legal:</w:t>
-      </w:r>
-      <w:r>
-        <w:t xml:space="preserve"> </w:t>
-      </w:r>
-      <w:r>
-        <w:t xml:space="preserve">- Adapters modifican el comportamiento del modelo base</w:t>
-      </w:r>
-      <w:r>
-        <w:t xml:space="preserve"> </w:t>
-      </w:r>
-      <w:r>
-        <w:t xml:space="preserve">- Aunque no cambies los pesos originales, SÍ cambias la salida del modelo</w:t>
-      </w:r>
-      <w:r>
-        <w:t xml:space="preserve"> </w:t>
-      </w:r>
-      <w:r>
-        <w:t xml:space="preserve">- Art. 3(63): Modificación sustancial = cambio que requiere nueva evaluación</w:t>
-      </w:r>
-    </w:p>
-    <w:p>
-      <w:pPr>
-        <w:pStyle w:val="BodyText"/>
-      </w:pPr>
-      <w:r>
-        <w:rPr>
-          <w:bCs/>
-          <w:b/>
-        </w:rPr>
-        <w:t xml:space="preserve">Obligaciones:</w:t>
-      </w:r>
-      <w:r>
-        <w:t xml:space="preserve"> </w:t>
-      </w:r>
-      <w:r>
-        <w:t xml:space="preserve">-</w:t>
-      </w:r>
-      <w:r>
-        <w:t xml:space="preserve"> </w:t>
-      </w:r>
-      <w:r>
-        <w:rPr>
-          <w:bCs/>
-          <w:b/>
-        </w:rPr>
-        <w:t xml:space="preserve">Art. 53:</w:t>
-      </w:r>
-      <w:r>
-        <w:t xml:space="preserve"> </w:t>
-      </w:r>
-      <w:r>
-        <w:t xml:space="preserve">Documentación técnica (Anexo XI), política copyright (Anexo XII), transparencia datos entrenamiento</w:t>
-      </w:r>
-      <w:r>
-        <w:t xml:space="preserve"> </w:t>
-      </w:r>
-      <w:r>
-        <w:t xml:space="preserve">-</w:t>
-      </w:r>
-      <w:r>
-        <w:t xml:space="preserve"> </w:t>
-      </w:r>
-      <w:r>
-        <w:rPr>
-          <w:bCs/>
-          <w:b/>
-        </w:rPr>
-        <w:t xml:space="preserve">Art. 6-27:</w:t>
-      </w:r>
-      <w:r>
-        <w:t xml:space="preserve"> </w:t>
-      </w:r>
-      <w:r>
-        <w:t xml:space="preserve">Si tu sistema es alto riesgo (ej: RRHH, banca, salud)</w:t>
-      </w:r>
-    </w:p>
-    <w:p>
-      <w:pPr>
-        <w:pStyle w:val="BodyText"/>
-      </w:pPr>
-      <w:r>
-        <w:rPr>
-          <w:bCs/>
-          <w:b/>
-        </w:rPr>
-        <w:t xml:space="preserve">Fecha límite:</w:t>
-      </w:r>
-      <w:r>
-        <w:t xml:space="preserve"> </w:t>
-      </w:r>
-      <w:r>
-        <w:rPr>
-          <w:bCs/>
-          <w:b/>
-        </w:rPr>
-        <w:t xml:space="preserve">2 agosto 2025</w:t>
-      </w:r>
-      <w:r>
-        <w:t xml:space="preserve"> </w:t>
-      </w:r>
-      <w:r>
-        <w:t xml:space="preserve">(GPAI) -</w:t>
-      </w:r>
-      <w:r>
-        <w:t xml:space="preserve"> </w:t>
-      </w:r>
-      <w:r>
-        <w:rPr>
-          <w:bCs/>
-          <w:b/>
-        </w:rPr>
-        <w:t xml:space="preserve">Solo 9 meses</w:t>
-      </w:r>
-    </w:p>
-    <w:p>
-      <w:pPr>
-        <w:pStyle w:val="BodyText"/>
-      </w:pPr>
-      <w:r>
-        <w:rPr>
-          <w:bCs/>
-          <w:b/>
-        </w:rPr>
-        <w:t xml:space="preserve">CodeflowX resuelve:</w:t>
-      </w:r>
-      <w:r>
-        <w:t xml:space="preserve"> </w:t>
-      </w:r>
-      <w:r>
-        <w:t xml:space="preserve">- Governance adapters (tracking versiones, evaluación calidad)</w:t>
-      </w:r>
-      <w:r>
-        <w:t xml:space="preserve"> </w:t>
-      </w:r>
-      <w:r>
-        <w:t xml:space="preserve">- Auto-generación Anexo XI/XII</w:t>
-      </w:r>
-      <w:r>
-        <w:t xml:space="preserve"> </w:t>
-      </w:r>
-      <w:r>
-        <w:t xml:space="preserve">- Documentación datos entrenamiento</w:t>
-      </w:r>
-      <w:r>
-        <w:t xml:space="preserve"> </w:t>
-      </w:r>
-      <w:r>
-        <w:t xml:space="preserve">- Evaluación post-modificación</w:t>
+        <w:t xml:space="preserve">Ventaja competitiva:</w:t>
+      </w:r>
+      <w:r>
+        <w:t xml:space="preserve"> </w:t>
+      </w:r>
+      <w:r>
+        <w:t xml:space="preserve">Si tu cliente opera internacionalmente, cumples múltiples jurisdicciones simultáneamente.</w:t>
       </w:r>
     </w:p>
     <w:p>
@@ -1326,8 +1416,18 @@
         </w:pict>
       </w:r>
     </w:p>
-    <w:bookmarkEnd w:id="22"/>
-    <w:bookmarkStart w:id="23" w:name="Xc3a8fd2888330d3a9cd9e8c4b3ab7582275f697"/>
+    <w:bookmarkEnd w:id="24"/>
+    <w:bookmarkEnd w:id="25"/>
+    <w:bookmarkStart w:id="36" w:name="faq-detallado---respuestas-directas"/>
+    <w:p>
+      <w:pPr>
+        <w:pStyle w:val="Heading2"/>
+      </w:pPr>
+      <w:r>
+        <w:t xml:space="preserve">📋 FAQ DETALLADO - RESPUESTAS DIRECTAS</w:t>
+      </w:r>
+    </w:p>
+    <w:bookmarkStart w:id="26" w:name="X1e807e84cf7ec42aca6a8d5da90c7fef67cf335"/>
     <w:p>
       <w:pPr>
         <w:pStyle w:val="Heading3"/>
@@ -1337,7 +1437,7 @@
           <w:bCs/>
           <w:b/>
         </w:rPr>
-        <w:t xml:space="preserve">P2: Recomendáis usar adapters vs modelos genéricos?</w:t>
+        <w:t xml:space="preserve">P1: ¿Si uso adapters (LoRA) soy proveedor GPAI?</w:t>
       </w:r>
     </w:p>
     <w:p>
@@ -1355,7 +1455,7 @@
           <w:bCs/>
           <w:b/>
         </w:rPr>
-        <w:t xml:space="preserve">SÍ, TOTALMENTE RECOMENDADO (pero con governance).</w:t>
+        <w:t xml:space="preserve">SÍ, probablemente eres proveedor GPAI.</w:t>
       </w:r>
     </w:p>
     <w:p>
@@ -1367,55 +1467,25 @@
           <w:bCs/>
           <w:b/>
         </w:rPr>
-        <w:t xml:space="preserve">Ventajas adapters:</w:t>
-      </w:r>
-      <w:r>
-        <w:t xml:space="preserve"> </w:t>
-      </w:r>
-      <w:r>
-        <w:t xml:space="preserve">- 10-100x más barato que fine-tuning completo</w:t>
-      </w:r>
-      <w:r>
-        <w:t xml:space="preserve"> </w:t>
-      </w:r>
-      <w:r>
-        <w:t xml:space="preserve">- Mejor precisión en tu dominio específico</w:t>
-      </w:r>
-      <w:r>
-        <w:t xml:space="preserve"> </w:t>
-      </w:r>
-      <w:r>
-        <w:t xml:space="preserve">- Menos sesgos (entrenas con TUS datos)</w:t>
-      </w:r>
-      <w:r>
-        <w:t xml:space="preserve"> </w:t>
-      </w:r>
-      <w:r>
-        <w:t xml:space="preserve">- Más control sobre comportamiento</w:t>
-      </w:r>
-      <w:r>
-        <w:t xml:space="preserve"> </w:t>
-      </w:r>
-      <w:r>
-        <w:t xml:space="preserve">- Menor riesgo de</w:t>
-      </w:r>
-      <w:r>
-        <w:t xml:space="preserve"> </w:t>
-      </w:r>
-      <w:r>
-        <w:t xml:space="preserve">“</w:t>
-      </w:r>
-      <w:r>
-        <w:t xml:space="preserve">olvido catastrófico</w:t>
-      </w:r>
-      <w:r>
-        <w:t xml:space="preserve">”</w:t>
-      </w:r>
-      <w:r>
-        <w:t xml:space="preserve"> </w:t>
-      </w:r>
-      <w:r>
-        <w:t xml:space="preserve">- Sostenibilidad (menos CO2)</w:t>
+        <w:t xml:space="preserve">Razonamiento legal:</w:t>
+      </w:r>
+      <w:r>
+        <w:t xml:space="preserve"> </w:t>
+      </w:r>
+      <w:r>
+        <w:t xml:space="preserve">- Adapters modifican el comportamiento del modelo base</w:t>
+      </w:r>
+      <w:r>
+        <w:t xml:space="preserve"> </w:t>
+      </w:r>
+      <w:r>
+        <w:t xml:space="preserve">- Aunque no cambies los pesos originales, SÍ cambias la salida del modelo</w:t>
+      </w:r>
+      <w:r>
+        <w:t xml:space="preserve"> </w:t>
+      </w:r>
+      <w:r>
+        <w:t xml:space="preserve">- Art. 3(63): Modificación sustancial = cambio que requiere nueva evaluación</w:t>
       </w:r>
     </w:p>
     <w:p>
@@ -1427,25 +1497,51 @@
           <w:bCs/>
           <w:b/>
         </w:rPr>
-        <w:t xml:space="preserve">Pero:</w:t>
-      </w:r>
-      <w:r>
-        <w:t xml:space="preserve"> </w:t>
-      </w:r>
-      <w:r>
-        <w:t xml:space="preserve">- Necesitas governance desde día 1 (Art. 53)</w:t>
-      </w:r>
-      <w:r>
-        <w:t xml:space="preserve"> </w:t>
-      </w:r>
-      <w:r>
-        <w:t xml:space="preserve">- Documentación obligatoria (Anexo XI/XII)</w:t>
-      </w:r>
-      <w:r>
-        <w:t xml:space="preserve"> </w:t>
-      </w:r>
-      <w:r>
-        <w:t xml:space="preserve">- Evaluación continua</w:t>
+        <w:t xml:space="preserve">Obligaciones:</w:t>
+      </w:r>
+      <w:r>
+        <w:t xml:space="preserve"> </w:t>
+      </w:r>
+      <w:r>
+        <w:t xml:space="preserve">-</w:t>
+      </w:r>
+      <w:r>
+        <w:t xml:space="preserve"> </w:t>
+      </w:r>
+      <w:r>
+        <w:rPr>
+          <w:bCs/>
+          <w:b/>
+        </w:rPr>
+        <w:t xml:space="preserve">Art. 53:</w:t>
+      </w:r>
+      <w:r>
+        <w:t xml:space="preserve"> </w:t>
+      </w:r>
+      <w:r>
+        <w:t xml:space="preserve">Documentación técnica (Anexo XI), política copyright (Anexo XII), transparencia datos entrenamiento</w:t>
+      </w:r>
+      <w:r>
+        <w:t xml:space="preserve"> </w:t>
+      </w:r>
+      <w:r>
+        <w:t xml:space="preserve">-</w:t>
+      </w:r>
+      <w:r>
+        <w:t xml:space="preserve"> </w:t>
+      </w:r>
+      <w:r>
+        <w:rPr>
+          <w:bCs/>
+          <w:b/>
+        </w:rPr>
+        <w:t xml:space="preserve">Art. 6-27:</w:t>
+      </w:r>
+      <w:r>
+        <w:t xml:space="preserve"> </w:t>
+      </w:r>
+      <w:r>
+        <w:t xml:space="preserve">Si tu sistema es alto riesgo (ej: RRHH, banca, salud)</w:t>
       </w:r>
     </w:p>
     <w:p>
@@ -1457,41 +1553,33 @@
           <w:bCs/>
           <w:b/>
         </w:rPr>
-        <w:t xml:space="preserve">Ejemplo real:</w:t>
-      </w:r>
-      <w:r>
-        <w:t xml:space="preserve"> </w:t>
-      </w:r>
-      <w:r>
-        <w:t xml:space="preserve">- Llama-3-8B genérico → 60% precisión en tu caso legal</w:t>
-      </w:r>
-      <w:r>
-        <w:t xml:space="preserve"> </w:t>
-      </w:r>
-      <w:r>
-        <w:t xml:space="preserve">- Llama-3-8B + LoRA entrenado con tus docs legales → 89% precisión</w:t>
-      </w:r>
-      <w:r>
-        <w:t xml:space="preserve"> </w:t>
-      </w:r>
-      <w:r>
-        <w:t xml:space="preserve">-</w:t>
-      </w:r>
-      <w:r>
-        <w:t xml:space="preserve"> </w:t>
-      </w:r>
-      <w:r>
-        <w:rPr>
-          <w:bCs/>
-          <w:b/>
-        </w:rPr>
-        <w:t xml:space="preserve">Ganancia:</w:t>
-      </w:r>
-      <w:r>
-        <w:t xml:space="preserve"> </w:t>
-      </w:r>
-      <w:r>
-        <w:t xml:space="preserve">29 puntos + cumplimiento normativo con CodeflowX</w:t>
+        <w:t xml:space="preserve">Fecha límite:</w:t>
+      </w:r>
+      <w:r>
+        <w:t xml:space="preserve"> </w:t>
+      </w:r>
+      <w:r>
+        <w:rPr>
+          <w:bCs/>
+          <w:b/>
+        </w:rPr>
+        <w:t xml:space="preserve">2 agosto 2025</w:t>
+      </w:r>
+      <w:r>
+        <w:t xml:space="preserve"> </w:t>
+      </w:r>
+      <w:r>
+        <w:t xml:space="preserve">(GPAI) -</w:t>
+      </w:r>
+      <w:r>
+        <w:t xml:space="preserve"> </w:t>
+      </w:r>
+      <w:r>
+        <w:rPr>
+          <w:bCs/>
+          <w:b/>
+        </w:rPr>
+        <w:t xml:space="preserve">Solo 9 meses</w:t>
       </w:r>
     </w:p>
     <w:p>
@@ -1503,13 +1591,31 @@
           <w:bCs/>
           <w:b/>
         </w:rPr>
-        <w:t xml:space="preserve">Mensaje:</w:t>
-      </w:r>
-      <w:r>
-        <w:t xml:space="preserve"> </w:t>
-      </w:r>
-      <w:r>
-        <w:t xml:space="preserve">Adapters son el futuro (eficiencia), pero necesitas plataforma que los gobierne.</w:t>
+        <w:t xml:space="preserve">CodeflowX resuelve:</w:t>
+      </w:r>
+      <w:r>
+        <w:t xml:space="preserve"> </w:t>
+      </w:r>
+      <w:r>
+        <w:t xml:space="preserve">- Governance adapters (tracking versiones, evaluación calidad)</w:t>
+      </w:r>
+      <w:r>
+        <w:t xml:space="preserve"> </w:t>
+      </w:r>
+      <w:r>
+        <w:t xml:space="preserve">- Auto-generación Anexo XI/XII</w:t>
+      </w:r>
+      <w:r>
+        <w:t xml:space="preserve"> </w:t>
+      </w:r>
+      <w:r>
+        <w:t xml:space="preserve">- Documentación datos entrenamiento</w:t>
+      </w:r>
+      <w:r>
+        <w:t xml:space="preserve"> </w:t>
+      </w:r>
+      <w:r>
+        <w:t xml:space="preserve">- Evaluación post-modificación</w:t>
       </w:r>
     </w:p>
     <w:p>
@@ -1519,8 +1625,8 @@
         </w:pict>
       </w:r>
     </w:p>
-    <w:bookmarkEnd w:id="23"/>
-    <w:bookmarkStart w:id="24" w:name="X2dc2cc521c7d8c3d7ade8a0e7e655acb4581a9e"/>
+    <w:bookmarkEnd w:id="26"/>
+    <w:bookmarkStart w:id="27" w:name="Xc3a8fd2888330d3a9cd9e8c4b3ab7582275f697"/>
     <w:p>
       <w:pPr>
         <w:pStyle w:val="Heading3"/>
@@ -1530,7 +1636,7 @@
           <w:bCs/>
           <w:b/>
         </w:rPr>
-        <w:t xml:space="preserve">P3: ¿Si uso GPT-4 de OpenAI me afecta el AI Act?</w:t>
+        <w:t xml:space="preserve">P2: Recomendáis usar adapters vs modelos genéricos?</w:t>
       </w:r>
     </w:p>
     <w:p>
@@ -1548,7 +1654,7 @@
           <w:bCs/>
           <w:b/>
         </w:rPr>
-        <w:t xml:space="preserve">SÍ, TE AFECTA (aunque no seas proveedor GPAI).</w:t>
+        <w:t xml:space="preserve">SÍ, TOTALMENTE RECOMENDADO (pero con governance).</w:t>
       </w:r>
     </w:p>
     <w:p>
@@ -1560,13 +1666,109 @@
           <w:bCs/>
           <w:b/>
         </w:rPr>
-        <w:t xml:space="preserve">Tu rol:</w:t>
-      </w:r>
-      <w:r>
-        <w:t xml:space="preserve"> </w:t>
-      </w:r>
-      <w:r>
-        <w:t xml:space="preserve">- OpenAI = Proveedor GPAI (Art. 53) → OpenAI cumple Anexo XI/XII</w:t>
+        <w:t xml:space="preserve">Ventajas adapters:</w:t>
+      </w:r>
+      <w:r>
+        <w:t xml:space="preserve"> </w:t>
+      </w:r>
+      <w:r>
+        <w:t xml:space="preserve">- 10-100x más barato que fine-tuning completo</w:t>
+      </w:r>
+      <w:r>
+        <w:t xml:space="preserve"> </w:t>
+      </w:r>
+      <w:r>
+        <w:t xml:space="preserve">- Mejor precisión en tu dominio específico</w:t>
+      </w:r>
+      <w:r>
+        <w:t xml:space="preserve"> </w:t>
+      </w:r>
+      <w:r>
+        <w:t xml:space="preserve">- Menos sesgos (entrenas con TUS datos)</w:t>
+      </w:r>
+      <w:r>
+        <w:t xml:space="preserve"> </w:t>
+      </w:r>
+      <w:r>
+        <w:t xml:space="preserve">- Más control sobre comportamiento</w:t>
+      </w:r>
+      <w:r>
+        <w:t xml:space="preserve"> </w:t>
+      </w:r>
+      <w:r>
+        <w:t xml:space="preserve">- Menor riesgo de</w:t>
+      </w:r>
+      <w:r>
+        <w:t xml:space="preserve"> </w:t>
+      </w:r>
+      <w:r>
+        <w:t xml:space="preserve">“</w:t>
+      </w:r>
+      <w:r>
+        <w:t xml:space="preserve">olvido catastrófico</w:t>
+      </w:r>
+      <w:r>
+        <w:t xml:space="preserve">”</w:t>
+      </w:r>
+      <w:r>
+        <w:t xml:space="preserve"> </w:t>
+      </w:r>
+      <w:r>
+        <w:t xml:space="preserve">- Sostenibilidad (menos CO2)</w:t>
+      </w:r>
+    </w:p>
+    <w:p>
+      <w:pPr>
+        <w:pStyle w:val="BodyText"/>
+      </w:pPr>
+      <w:r>
+        <w:rPr>
+          <w:bCs/>
+          <w:b/>
+        </w:rPr>
+        <w:t xml:space="preserve">Pero:</w:t>
+      </w:r>
+      <w:r>
+        <w:t xml:space="preserve"> </w:t>
+      </w:r>
+      <w:r>
+        <w:t xml:space="preserve">- Necesitas governance desde día 1 (Art. 53)</w:t>
+      </w:r>
+      <w:r>
+        <w:t xml:space="preserve"> </w:t>
+      </w:r>
+      <w:r>
+        <w:t xml:space="preserve">- Documentación obligatoria (Anexo XI/XII)</w:t>
+      </w:r>
+      <w:r>
+        <w:t xml:space="preserve"> </w:t>
+      </w:r>
+      <w:r>
+        <w:t xml:space="preserve">- Evaluación continua</w:t>
+      </w:r>
+    </w:p>
+    <w:p>
+      <w:pPr>
+        <w:pStyle w:val="BodyText"/>
+      </w:pPr>
+      <w:r>
+        <w:rPr>
+          <w:bCs/>
+          <w:b/>
+        </w:rPr>
+        <w:t xml:space="preserve">Ejemplo real:</w:t>
+      </w:r>
+      <w:r>
+        <w:t xml:space="preserve"> </w:t>
+      </w:r>
+      <w:r>
+        <w:t xml:space="preserve">- Llama-3-8B genérico → 60% precisión en tu caso legal</w:t>
+      </w:r>
+      <w:r>
+        <w:t xml:space="preserve"> </w:t>
+      </w:r>
+      <w:r>
+        <w:t xml:space="preserve">- Llama-3-8B + LoRA entrenado con tus docs legales → 89% precisión</w:t>
       </w:r>
       <w:r>
         <w:t xml:space="preserve"> </w:t>
@@ -1582,13 +1784,13 @@
           <w:bCs/>
           <w:b/>
         </w:rPr>
-        <w:t xml:space="preserve">Tú = Proveedor sistema de IA</w:t>
-      </w:r>
-      <w:r>
-        <w:t xml:space="preserve"> </w:t>
-      </w:r>
-      <w:r>
-        <w:t xml:space="preserve">(Art. 6-27)</w:t>
+        <w:t xml:space="preserve">Ganancia:</w:t>
+      </w:r>
+      <w:r>
+        <w:t xml:space="preserve"> </w:t>
+      </w:r>
+      <w:r>
+        <w:t xml:space="preserve">29 puntos + cumplimiento normativo con CodeflowX</w:t>
       </w:r>
     </w:p>
     <w:p>
@@ -1600,125 +1802,13 @@
           <w:bCs/>
           <w:b/>
         </w:rPr>
-        <w:t xml:space="preserve">Ejemplo chatbot RRHH con GPT-4:</w:t>
-      </w:r>
-      <w:r>
-        <w:t xml:space="preserve"> </w:t>
-      </w:r>
-      <w:r>
-        <w:t xml:space="preserve">- Sistema alto riesgo (Anexo III.4 - Empleo)</w:t>
-      </w:r>
-      <w:r>
-        <w:t xml:space="preserve"> </w:t>
-      </w:r>
-      <w:r>
-        <w:t xml:space="preserve">-</w:t>
-      </w:r>
-      <w:r>
-        <w:t xml:space="preserve"> </w:t>
-      </w:r>
-      <w:r>
-        <w:rPr>
-          <w:bCs/>
-          <w:b/>
-        </w:rPr>
-        <w:t xml:space="preserve">TÚ debes cumplir:</w:t>
-      </w:r>
-      <w:r>
-        <w:t xml:space="preserve"> </w:t>
-      </w:r>
-      <w:r>
-        <w:t xml:space="preserve">- Art. 9: Gestión riesgos (evaluar sesgos, precisión)</w:t>
-      </w:r>
-      <w:r>
-        <w:t xml:space="preserve"> </w:t>
-      </w:r>
-      <w:r>
-        <w:t xml:space="preserve">- Art. 10: Gobernanza datos (CVs usados, calidad, bias)</w:t>
-      </w:r>
-      <w:r>
-        <w:t xml:space="preserve"> </w:t>
-      </w:r>
-      <w:r>
-        <w:t xml:space="preserve">- Art. 11 + Anexo IV: Documentación técnica</w:t>
-      </w:r>
-      <w:r>
-        <w:t xml:space="preserve"> </w:t>
-      </w:r>
-      <w:r>
-        <w:t xml:space="preserve">- Art. 12: Mantenimiento registros</w:t>
-      </w:r>
-      <w:r>
-        <w:t xml:space="preserve"> </w:t>
-      </w:r>
-      <w:r>
-        <w:t xml:space="preserve">- Art. 13: Transparencia (candidatos saben cómo funciona)</w:t>
-      </w:r>
-      <w:r>
-        <w:t xml:space="preserve"> </w:t>
-      </w:r>
-      <w:r>
-        <w:t xml:space="preserve">- Art. 14: Supervisión humana (HITL)</w:t>
-      </w:r>
-      <w:r>
-        <w:t xml:space="preserve"> </w:t>
-      </w:r>
-      <w:r>
-        <w:t xml:space="preserve">- Art. 15: Robustez, ciberseguridad</w:t>
-      </w:r>
-      <w:r>
-        <w:t xml:space="preserve"> </w:t>
-      </w:r>
-      <w:r>
-        <w:t xml:space="preserve">- Art. 19: Logs inmutables</w:t>
-      </w:r>
-      <w:r>
-        <w:t xml:space="preserve"> </w:t>
-      </w:r>
-      <w:r>
-        <w:t xml:space="preserve">- Art. 27: FRIA (si organismo público)</w:t>
-      </w:r>
-      <w:r>
-        <w:t xml:space="preserve"> </w:t>
-      </w:r>
-      <w:r>
-        <w:t xml:space="preserve">- Art. 49: Registro BBDD UE</w:t>
-      </w:r>
-    </w:p>
-    <w:p>
-      <w:pPr>
-        <w:pStyle w:val="BodyText"/>
-      </w:pPr>
-      <w:r>
-        <w:rPr>
-          <w:bCs/>
-          <w:b/>
-        </w:rPr>
-        <w:t xml:space="preserve">Respuesta corta:</w:t>
-      </w:r>
-      <w:r>
-        <w:t xml:space="preserve"> </w:t>
-      </w:r>
-      <w:r>
-        <w:t xml:space="preserve">Usar GPT-4 NO te exime. Tú eres proveedor del sistema.</w:t>
-      </w:r>
-    </w:p>
-    <w:p>
-      <w:pPr>
-        <w:pStyle w:val="BodyText"/>
-      </w:pPr>
-      <w:r>
-        <w:rPr>
-          <w:bCs/>
-          <w:b/>
-        </w:rPr>
-        <w:t xml:space="preserve">Fecha límite:</w:t>
-      </w:r>
-      <w:r>
-        <w:t xml:space="preserve"> </w:t>
-      </w:r>
-      <w:r>
-        <w:t xml:space="preserve">2 agosto 2027 (alto riesgo)</w:t>
+        <w:t xml:space="preserve">Mensaje:</w:t>
+      </w:r>
+      <w:r>
+        <w:t xml:space="preserve"> </w:t>
+      </w:r>
+      <w:r>
+        <w:t xml:space="preserve">Adapters son el futuro (eficiencia), pero necesitas plataforma que los gobierne.</w:t>
       </w:r>
     </w:p>
     <w:p>
@@ -1728,8 +1818,217 @@
         </w:pict>
       </w:r>
     </w:p>
-    <w:bookmarkEnd w:id="24"/>
-    <w:bookmarkStart w:id="25" w:name="X11816db0a6c870e7cc52d20e4d51d58993703a6"/>
+    <w:bookmarkEnd w:id="27"/>
+    <w:bookmarkStart w:id="28" w:name="X2dc2cc521c7d8c3d7ade8a0e7e655acb4581a9e"/>
+    <w:p>
+      <w:pPr>
+        <w:pStyle w:val="Heading3"/>
+      </w:pPr>
+      <w:r>
+        <w:rPr>
+          <w:bCs/>
+          <w:b/>
+        </w:rPr>
+        <w:t xml:space="preserve">P3: ¿Si uso GPT-4 de OpenAI me afecta el AI Act?</w:t>
+      </w:r>
+    </w:p>
+    <w:p>
+      <w:pPr>
+        <w:pStyle w:val="FirstParagraph"/>
+      </w:pPr>
+      <w:r>
+        <w:t xml:space="preserve">✅</w:t>
+      </w:r>
+      <w:r>
+        <w:t xml:space="preserve"> </w:t>
+      </w:r>
+      <w:r>
+        <w:rPr>
+          <w:bCs/>
+          <w:b/>
+        </w:rPr>
+        <w:t xml:space="preserve">SÍ, TE AFECTA (aunque no seas proveedor GPAI).</w:t>
+      </w:r>
+    </w:p>
+    <w:p>
+      <w:pPr>
+        <w:pStyle w:val="BodyText"/>
+      </w:pPr>
+      <w:r>
+        <w:rPr>
+          <w:bCs/>
+          <w:b/>
+        </w:rPr>
+        <w:t xml:space="preserve">Tu rol:</w:t>
+      </w:r>
+      <w:r>
+        <w:t xml:space="preserve"> </w:t>
+      </w:r>
+      <w:r>
+        <w:t xml:space="preserve">- OpenAI = Proveedor GPAI (Art. 53) → OpenAI cumple Anexo XI/XII</w:t>
+      </w:r>
+      <w:r>
+        <w:t xml:space="preserve"> </w:t>
+      </w:r>
+      <w:r>
+        <w:t xml:space="preserve">-</w:t>
+      </w:r>
+      <w:r>
+        <w:t xml:space="preserve"> </w:t>
+      </w:r>
+      <w:r>
+        <w:rPr>
+          <w:bCs/>
+          <w:b/>
+        </w:rPr>
+        <w:t xml:space="preserve">Tú = Proveedor sistema de IA</w:t>
+      </w:r>
+      <w:r>
+        <w:t xml:space="preserve"> </w:t>
+      </w:r>
+      <w:r>
+        <w:t xml:space="preserve">(Art. 6-27)</w:t>
+      </w:r>
+    </w:p>
+    <w:p>
+      <w:pPr>
+        <w:pStyle w:val="BodyText"/>
+      </w:pPr>
+      <w:r>
+        <w:rPr>
+          <w:bCs/>
+          <w:b/>
+        </w:rPr>
+        <w:t xml:space="preserve">Ejemplo chatbot RRHH con GPT-4:</w:t>
+      </w:r>
+      <w:r>
+        <w:t xml:space="preserve"> </w:t>
+      </w:r>
+      <w:r>
+        <w:t xml:space="preserve">- Sistema alto riesgo (Anexo III.4 - Empleo)</w:t>
+      </w:r>
+      <w:r>
+        <w:t xml:space="preserve"> </w:t>
+      </w:r>
+      <w:r>
+        <w:t xml:space="preserve">-</w:t>
+      </w:r>
+      <w:r>
+        <w:t xml:space="preserve"> </w:t>
+      </w:r>
+      <w:r>
+        <w:rPr>
+          <w:bCs/>
+          <w:b/>
+        </w:rPr>
+        <w:t xml:space="preserve">TÚ debes cumplir:</w:t>
+      </w:r>
+      <w:r>
+        <w:t xml:space="preserve"> </w:t>
+      </w:r>
+      <w:r>
+        <w:t xml:space="preserve">- Art. 9: Gestión riesgos (evaluar sesgos, precisión)</w:t>
+      </w:r>
+      <w:r>
+        <w:t xml:space="preserve"> </w:t>
+      </w:r>
+      <w:r>
+        <w:t xml:space="preserve">- Art. 10: Gobernanza datos (CVs usados, calidad, bias)</w:t>
+      </w:r>
+      <w:r>
+        <w:t xml:space="preserve"> </w:t>
+      </w:r>
+      <w:r>
+        <w:t xml:space="preserve">- Art. 11 + Anexo IV: Documentación técnica</w:t>
+      </w:r>
+      <w:r>
+        <w:t xml:space="preserve"> </w:t>
+      </w:r>
+      <w:r>
+        <w:t xml:space="preserve">- Art. 12: Mantenimiento registros</w:t>
+      </w:r>
+      <w:r>
+        <w:t xml:space="preserve"> </w:t>
+      </w:r>
+      <w:r>
+        <w:t xml:space="preserve">- Art. 13: Transparencia (candidatos saben cómo funciona)</w:t>
+      </w:r>
+      <w:r>
+        <w:t xml:space="preserve"> </w:t>
+      </w:r>
+      <w:r>
+        <w:t xml:space="preserve">- Art. 14: Supervisión humana (HITL)</w:t>
+      </w:r>
+      <w:r>
+        <w:t xml:space="preserve"> </w:t>
+      </w:r>
+      <w:r>
+        <w:t xml:space="preserve">- Art. 15: Robustez, ciberseguridad</w:t>
+      </w:r>
+      <w:r>
+        <w:t xml:space="preserve"> </w:t>
+      </w:r>
+      <w:r>
+        <w:t xml:space="preserve">- Art. 19: Logs inmutables</w:t>
+      </w:r>
+      <w:r>
+        <w:t xml:space="preserve"> </w:t>
+      </w:r>
+      <w:r>
+        <w:t xml:space="preserve">- Art. 27: FRIA (si organismo público)</w:t>
+      </w:r>
+      <w:r>
+        <w:t xml:space="preserve"> </w:t>
+      </w:r>
+      <w:r>
+        <w:t xml:space="preserve">- Art. 49: Registro BBDD UE</w:t>
+      </w:r>
+    </w:p>
+    <w:p>
+      <w:pPr>
+        <w:pStyle w:val="BodyText"/>
+      </w:pPr>
+      <w:r>
+        <w:rPr>
+          <w:bCs/>
+          <w:b/>
+        </w:rPr>
+        <w:t xml:space="preserve">Respuesta corta:</w:t>
+      </w:r>
+      <w:r>
+        <w:t xml:space="preserve"> </w:t>
+      </w:r>
+      <w:r>
+        <w:t xml:space="preserve">Usar GPT-4 NO te exime. Tú eres proveedor del sistema.</w:t>
+      </w:r>
+    </w:p>
+    <w:p>
+      <w:pPr>
+        <w:pStyle w:val="BodyText"/>
+      </w:pPr>
+      <w:r>
+        <w:rPr>
+          <w:bCs/>
+          <w:b/>
+        </w:rPr>
+        <w:t xml:space="preserve">Fecha límite:</w:t>
+      </w:r>
+      <w:r>
+        <w:t xml:space="preserve"> </w:t>
+      </w:r>
+      <w:r>
+        <w:t xml:space="preserve">2 agosto 2027 (alto riesgo)</w:t>
+      </w:r>
+    </w:p>
+    <w:p>
+      <w:r>
+        <w:pict>
+          <v:rect style="width:0;height:1.5pt" o:hralign="center" o:hrstd="t" o:hr="t"/>
+        </w:pict>
+      </w:r>
+    </w:p>
+    <w:bookmarkEnd w:id="28"/>
+    <w:bookmarkStart w:id="29" w:name="X11816db0a6c870e7cc52d20e4d51d58993703a6"/>
     <w:p>
       <w:pPr>
         <w:pStyle w:val="Heading3"/>
@@ -2073,8 +2372,8 @@
         </w:pict>
       </w:r>
     </w:p>
-    <w:bookmarkEnd w:id="25"/>
-    <w:bookmarkStart w:id="26" w:name="p5-rag-me-hace-proveedor-gpai"/>
+    <w:bookmarkEnd w:id="29"/>
+    <w:bookmarkStart w:id="30" w:name="p5-rag-me-hace-proveedor-gpai"/>
     <w:p>
       <w:pPr>
         <w:pStyle w:val="Heading3"/>
@@ -2318,8 +2617,8 @@
         </w:pict>
       </w:r>
     </w:p>
-    <w:bookmarkEnd w:id="26"/>
-    <w:bookmarkStart w:id="27" w:name="p6-merge-de-modelos-ej-llamamistral"/>
+    <w:bookmarkEnd w:id="30"/>
+    <w:bookmarkStart w:id="31" w:name="p6-merge-de-modelos-ej-llamamistral"/>
     <w:p>
       <w:pPr>
         <w:pStyle w:val="Heading3"/>
@@ -2525,8 +2824,8 @@
         </w:pict>
       </w:r>
     </w:p>
-    <w:bookmarkEnd w:id="27"/>
-    <w:bookmarkStart w:id="28" w:name="p7-cuantizar-modelos-gguf-4-bit"/>
+    <w:bookmarkEnd w:id="31"/>
+    <w:bookmarkStart w:id="32" w:name="p7-cuantizar-modelos-gguf-4-bit"/>
     <w:p>
       <w:pPr>
         <w:pStyle w:val="Heading3"/>
@@ -2674,8 +2973,8 @@
         </w:pict>
       </w:r>
     </w:p>
-    <w:bookmarkEnd w:id="28"/>
-    <w:bookmarkStart w:id="29" w:name="X23760cb50a5a5e91ac6597eaaf79e1c99510485"/>
+    <w:bookmarkEnd w:id="32"/>
+    <w:bookmarkStart w:id="33" w:name="X23760cb50a5a5e91ac6597eaaf79e1c99510485"/>
     <w:p>
       <w:pPr>
         <w:pStyle w:val="Heading3"/>
@@ -2766,1238 +3065,6 @@
       </w:r>
       <w:r>
         <w:t xml:space="preserve">- Revisión decisiones antes de ejecutar acciones críticas</w:t>
-      </w:r>
-    </w:p>
-    <w:p>
-      <w:pPr>
-        <w:numPr>
-          <w:ilvl w:val="0"/>
-          <w:numId w:val="1001"/>
-        </w:numPr>
-        <w:pStyle w:val="Compact"/>
-      </w:pPr>
-      <w:r>
-        <w:rPr>
-          <w:bCs/>
-          <w:b/>
-        </w:rPr>
-        <w:t xml:space="preserve">Art. 13:</w:t>
-      </w:r>
-      <w:r>
-        <w:t xml:space="preserve"> </w:t>
-      </w:r>
-      <w:r>
-        <w:t xml:space="preserve">Transparencia decisiones</w:t>
-      </w:r>
-    </w:p>
-    <w:p>
-      <w:pPr>
-        <w:numPr>
-          <w:ilvl w:val="1"/>
-          <w:numId w:val="1002"/>
-        </w:numPr>
-        <w:pStyle w:val="Compact"/>
-      </w:pPr>
-      <w:r>
-        <w:t xml:space="preserve">Explicar POR QUÉ el agente tomó esa decisión</w:t>
-      </w:r>
-    </w:p>
-    <w:p>
-      <w:pPr>
-        <w:numPr>
-          <w:ilvl w:val="1"/>
-          <w:numId w:val="1002"/>
-        </w:numPr>
-        <w:pStyle w:val="Compact"/>
-      </w:pPr>
-      <w:r>
-        <w:t xml:space="preserve">Qué tools usó</w:t>
-      </w:r>
-    </w:p>
-    <w:p>
-      <w:pPr>
-        <w:numPr>
-          <w:ilvl w:val="1"/>
-          <w:numId w:val="1002"/>
-        </w:numPr>
-        <w:pStyle w:val="Compact"/>
-      </w:pPr>
-      <w:r>
-        <w:t xml:space="preserve">Qué datos consultó</w:t>
-      </w:r>
-    </w:p>
-    <w:p>
-      <w:pPr>
-        <w:numPr>
-          <w:ilvl w:val="0"/>
-          <w:numId w:val="1001"/>
-        </w:numPr>
-        <w:pStyle w:val="Compact"/>
-      </w:pPr>
-      <w:r>
-        <w:rPr>
-          <w:bCs/>
-          <w:b/>
-        </w:rPr>
-        <w:t xml:space="preserve">Art. 19:</w:t>
-      </w:r>
-      <w:r>
-        <w:t xml:space="preserve"> </w:t>
-      </w:r>
-      <w:r>
-        <w:t xml:space="preserve">Logs inmutables</w:t>
-      </w:r>
-    </w:p>
-    <w:p>
-      <w:pPr>
-        <w:numPr>
-          <w:ilvl w:val="1"/>
-          <w:numId w:val="1003"/>
-        </w:numPr>
-        <w:pStyle w:val="Compact"/>
-      </w:pPr>
-      <w:r>
-        <w:t xml:space="preserve">Todas las decisiones del agente</w:t>
-      </w:r>
-    </w:p>
-    <w:p>
-      <w:pPr>
-        <w:numPr>
-          <w:ilvl w:val="1"/>
-          <w:numId w:val="1003"/>
-        </w:numPr>
-        <w:pStyle w:val="Compact"/>
-      </w:pPr>
-      <w:r>
-        <w:t xml:space="preserve">Acciones ejecutadas</w:t>
-      </w:r>
-    </w:p>
-    <w:p>
-      <w:pPr>
-        <w:numPr>
-          <w:ilvl w:val="1"/>
-          <w:numId w:val="1003"/>
-        </w:numPr>
-        <w:pStyle w:val="Compact"/>
-      </w:pPr>
-      <w:r>
-        <w:t xml:space="preserve">Intervenciones humanas</w:t>
-      </w:r>
-    </w:p>
-    <w:p>
-      <w:pPr>
-        <w:pStyle w:val="FirstParagraph"/>
-      </w:pPr>
-      <w:r>
-        <w:rPr>
-          <w:bCs/>
-          <w:b/>
-        </w:rPr>
-        <w:t xml:space="preserve">Si agente es alto riesgo (ej: agente que aprueba créditos):</w:t>
-      </w:r>
-      <w:r>
-        <w:t xml:space="preserve"> </w:t>
-      </w:r>
-      <w:r>
-        <w:t xml:space="preserve">-</w:t>
-      </w:r>
-      <w:r>
-        <w:t xml:space="preserve"> </w:t>
-      </w:r>
-      <w:r>
-        <w:rPr>
-          <w:bCs/>
-          <w:b/>
-        </w:rPr>
-        <w:t xml:space="preserve">Fecha límite:</w:t>
-      </w:r>
-      <w:r>
-        <w:t xml:space="preserve"> </w:t>
-      </w:r>
-      <w:r>
-        <w:t xml:space="preserve">2 agosto 2027</w:t>
-      </w:r>
-      <w:r>
-        <w:t xml:space="preserve"> </w:t>
-      </w:r>
-      <w:r>
-        <w:t xml:space="preserve">- Art. 6-27 completo</w:t>
-      </w:r>
-    </w:p>
-    <w:p>
-      <w:pPr>
-        <w:pStyle w:val="BodyText"/>
-      </w:pPr>
-      <w:r>
-        <w:rPr>
-          <w:bCs/>
-          <w:b/>
-        </w:rPr>
-        <w:t xml:space="preserve">CodeflowX gobierna agentes:</w:t>
-      </w:r>
-      <w:r>
-        <w:t xml:space="preserve"> </w:t>
-      </w:r>
-      <w:r>
-        <w:t xml:space="preserve">- HITL integrado (stop, approve, reject)</w:t>
-      </w:r>
-      <w:r>
-        <w:t xml:space="preserve"> </w:t>
-      </w:r>
-      <w:r>
-        <w:t xml:space="preserve">- Explicabilidad decisiones (AI Interpreter)</w:t>
-      </w:r>
-      <w:r>
-        <w:t xml:space="preserve"> </w:t>
-      </w:r>
-      <w:r>
-        <w:t xml:space="preserve">- Logs inmutables automáticos</w:t>
-      </w:r>
-      <w:r>
-        <w:t xml:space="preserve"> </w:t>
-      </w:r>
-      <w:r>
-        <w:t xml:space="preserve">- Monitoring autonomía (drift detection)</w:t>
-      </w:r>
-    </w:p>
-    <w:p>
-      <w:r>
-        <w:pict>
-          <v:rect style="width:0;height:1.5pt" o:hralign="center" o:hrstd="t" o:hr="t"/>
-        </w:pict>
-      </w:r>
-    </w:p>
-    <w:bookmarkEnd w:id="29"/>
-    <w:bookmarkStart w:id="30" w:name="Xe3d59b7884c1ca60b80b499badfc000b9f1d9f7"/>
-    <w:p>
-      <w:pPr>
-        <w:pStyle w:val="Heading3"/>
-      </w:pPr>
-      <w:r>
-        <w:rPr>
-          <w:bCs/>
-          <w:b/>
-        </w:rPr>
-        <w:t xml:space="preserve">P9: ¿Sistemas NO alto riesgo tienen obligaciones?</w:t>
-      </w:r>
-    </w:p>
-    <w:p>
-      <w:pPr>
-        <w:pStyle w:val="FirstParagraph"/>
-      </w:pPr>
-      <w:r>
-        <w:t xml:space="preserve">✅</w:t>
-      </w:r>
-      <w:r>
-        <w:t xml:space="preserve"> </w:t>
-      </w:r>
-      <w:r>
-        <w:rPr>
-          <w:bCs/>
-          <w:b/>
-        </w:rPr>
-        <w:t xml:space="preserve">SÍ, mínimo Art. 52 (transparencia).</w:t>
-      </w:r>
-    </w:p>
-    <w:p>
-      <w:pPr>
-        <w:pStyle w:val="BodyText"/>
-      </w:pPr>
-      <w:r>
-        <w:rPr>
-          <w:bCs/>
-          <w:b/>
-        </w:rPr>
-        <w:t xml:space="preserve">Obligaciones mínimas CUALQUIER sistema IA:</w:t>
-      </w:r>
-    </w:p>
-    <w:p>
-      <w:pPr>
-        <w:pStyle w:val="BodyText"/>
-      </w:pPr>
-      <w:r>
-        <w:rPr>
-          <w:bCs/>
-          <w:b/>
-        </w:rPr>
-        <w:t xml:space="preserve">Art. 52 - Transparencia:</w:t>
-      </w:r>
-      <w:r>
-        <w:t xml:space="preserve"> </w:t>
-      </w:r>
-      <w:r>
-        <w:t xml:space="preserve">- Si chatbot → Usuario debe saber que habla con IA, no humano</w:t>
-      </w:r>
-      <w:r>
-        <w:t xml:space="preserve"> </w:t>
-      </w:r>
-      <w:r>
-        <w:t xml:space="preserve">- Si contenido generado por IA → Debe estar identificado</w:t>
-      </w:r>
-      <w:r>
-        <w:t xml:space="preserve"> </w:t>
-      </w:r>
-      <w:r>
-        <w:t xml:space="preserve">- Si deep fake → Obligatorio indicar que es manipulado</w:t>
-      </w:r>
-    </w:p>
-    <w:p>
-      <w:pPr>
-        <w:pStyle w:val="BodyText"/>
-      </w:pPr>
-      <w:r>
-        <w:rPr>
-          <w:bCs/>
-          <w:b/>
-        </w:rPr>
-        <w:t xml:space="preserve">Fecha límite:</w:t>
-      </w:r>
-      <w:r>
-        <w:t xml:space="preserve"> </w:t>
-      </w:r>
-      <w:r>
-        <w:t xml:space="preserve">2 agosto 2026 (aplicación general)</w:t>
-      </w:r>
-    </w:p>
-    <w:p>
-      <w:pPr>
-        <w:pStyle w:val="BodyText"/>
-      </w:pPr>
-      <w:r>
-        <w:rPr>
-          <w:bCs/>
-          <w:b/>
-        </w:rPr>
-        <w:t xml:space="preserve">Ejemplo chatbot web ecommerce:</w:t>
-      </w:r>
-      <w:r>
-        <w:t xml:space="preserve"> </w:t>
-      </w:r>
-      <w:r>
-        <w:t xml:space="preserve">- NO alto riesgo (solo vende productos)</w:t>
-      </w:r>
-      <w:r>
-        <w:t xml:space="preserve"> </w:t>
-      </w:r>
-      <w:r>
-        <w:t xml:space="preserve">- Pero</w:t>
-      </w:r>
-      <w:r>
-        <w:t xml:space="preserve"> </w:t>
-      </w:r>
-      <w:r>
-        <w:rPr>
-          <w:bCs/>
-          <w:b/>
-        </w:rPr>
-        <w:t xml:space="preserve">SÍ Art. 52</w:t>
-      </w:r>
-      <w:r>
-        <w:t xml:space="preserve"> </w:t>
-      </w:r>
-      <w:r>
-        <w:t xml:space="preserve">→</w:t>
-      </w:r>
-      <w:r>
-        <w:t xml:space="preserve"> </w:t>
-      </w:r>
-      <w:r>
-        <w:t xml:space="preserve">“</w:t>
-      </w:r>
-      <w:r>
-        <w:t xml:space="preserve">Estás hablando con un asistente virtual IA</w:t>
-      </w:r>
-      <w:r>
-        <w:t xml:space="preserve">”</w:t>
-      </w:r>
-      <w:r>
-        <w:t xml:space="preserve"> </w:t>
-      </w:r>
-      <w:r>
-        <w:t xml:space="preserve">-</w:t>
-      </w:r>
-      <w:r>
-        <w:t xml:space="preserve"> </w:t>
-      </w:r>
-      <w:r>
-        <w:rPr>
-          <w:bCs/>
-          <w:b/>
-        </w:rPr>
-        <w:t xml:space="preserve">SÍ logs</w:t>
-      </w:r>
-      <w:r>
-        <w:t xml:space="preserve"> </w:t>
-      </w:r>
-      <w:r>
-        <w:t xml:space="preserve">(buena práctica para RGPD)</w:t>
-      </w:r>
-    </w:p>
-    <w:p>
-      <w:r>
-        <w:pict>
-          <v:rect style="width:0;height:1.5pt" o:hralign="center" o:hrstd="t" o:hr="t"/>
-        </w:pict>
-      </w:r>
-    </w:p>
-    <w:bookmarkEnd w:id="30"/>
-    <w:bookmarkStart w:id="31" w:name="p10-soy-proveedor-o-deployerusuario"/>
-    <w:p>
-      <w:pPr>
-        <w:pStyle w:val="Heading3"/>
-      </w:pPr>
-      <w:r>
-        <w:rPr>
-          <w:bCs/>
-          <w:b/>
-        </w:rPr>
-        <w:t xml:space="preserve">P10: ¿Soy</w:t>
-      </w:r>
-      <w:r>
-        <w:rPr>
-          <w:bCs/>
-          <w:b/>
-        </w:rPr>
-        <w:t xml:space="preserve"> </w:t>
-      </w:r>
-      <w:r>
-        <w:rPr>
-          <w:bCs/>
-          <w:b/>
-        </w:rPr>
-        <w:t xml:space="preserve">“</w:t>
-      </w:r>
-      <w:r>
-        <w:rPr>
-          <w:bCs/>
-          <w:b/>
-        </w:rPr>
-        <w:t xml:space="preserve">proveedor</w:t>
-      </w:r>
-      <w:r>
-        <w:rPr>
-          <w:bCs/>
-          <w:b/>
-        </w:rPr>
-        <w:t xml:space="preserve">”</w:t>
-      </w:r>
-      <w:r>
-        <w:rPr>
-          <w:bCs/>
-          <w:b/>
-        </w:rPr>
-        <w:t xml:space="preserve"> </w:t>
-      </w:r>
-      <w:r>
-        <w:rPr>
-          <w:bCs/>
-          <w:b/>
-        </w:rPr>
-        <w:t xml:space="preserve">o</w:t>
-      </w:r>
-      <w:r>
-        <w:rPr>
-          <w:bCs/>
-          <w:b/>
-        </w:rPr>
-        <w:t xml:space="preserve"> </w:t>
-      </w:r>
-      <w:r>
-        <w:rPr>
-          <w:bCs/>
-          <w:b/>
-        </w:rPr>
-        <w:t xml:space="preserve">“</w:t>
-      </w:r>
-      <w:r>
-        <w:rPr>
-          <w:bCs/>
-          <w:b/>
-        </w:rPr>
-        <w:t xml:space="preserve">deployer/usuario</w:t>
-      </w:r>
-      <w:r>
-        <w:rPr>
-          <w:bCs/>
-          <w:b/>
-        </w:rPr>
-        <w:t xml:space="preserve">”</w:t>
-      </w:r>
-      <w:r>
-        <w:rPr>
-          <w:bCs/>
-          <w:b/>
-        </w:rPr>
-        <w:t xml:space="preserve">?</w:t>
-      </w:r>
-    </w:p>
-    <w:p>
-      <w:pPr>
-        <w:pStyle w:val="FirstParagraph"/>
-      </w:pPr>
-      <w:r>
-        <w:rPr>
-          <w:bCs/>
-          <w:b/>
-        </w:rPr>
-        <w:t xml:space="preserve">PROVEEDOR (Obligaciones completas Art. 16-27):</w:t>
-      </w:r>
-      <w:r>
-        <w:t xml:space="preserve"> </w:t>
-      </w:r>
-      <w:r>
-        <w:t xml:space="preserve">- Desarrollas sistema IA (aunque uses modelos terceros)</w:t>
-      </w:r>
-      <w:r>
-        <w:t xml:space="preserve"> </w:t>
-      </w:r>
-      <w:r>
-        <w:t xml:space="preserve">- Modificas sistema IA existente sustancialmente</w:t>
-      </w:r>
-      <w:r>
-        <w:t xml:space="preserve"> </w:t>
-      </w:r>
-      <w:r>
-        <w:t xml:space="preserve">- Pones tu nombre/marca en el sistema</w:t>
-      </w:r>
-      <w:r>
-        <w:t xml:space="preserve"> </w:t>
-      </w:r>
-      <w:r>
-        <w:t xml:space="preserve">- Lo vendes/distribuyes a clientes</w:t>
-      </w:r>
-    </w:p>
-    <w:p>
-      <w:pPr>
-        <w:pStyle w:val="BodyText"/>
-      </w:pPr>
-      <w:r>
-        <w:rPr>
-          <w:bCs/>
-          <w:b/>
-        </w:rPr>
-        <w:t xml:space="preserve">Ejemplos proveedores:</w:t>
-      </w:r>
-      <w:r>
-        <w:t xml:space="preserve"> </w:t>
-      </w:r>
-      <w:r>
-        <w:t xml:space="preserve">- Consultora que crea chatbot GPT-4 para banco →</w:t>
-      </w:r>
-      <w:r>
-        <w:t xml:space="preserve"> </w:t>
-      </w:r>
-      <w:r>
-        <w:rPr>
-          <w:bCs/>
-          <w:b/>
-        </w:rPr>
-        <w:t xml:space="preserve">PROVEEDOR</w:t>
-      </w:r>
-      <w:r>
-        <w:t xml:space="preserve"> </w:t>
-      </w:r>
-      <w:r>
-        <w:t xml:space="preserve">- Startup que hace RAG con Llama para SaaS →</w:t>
-      </w:r>
-      <w:r>
-        <w:t xml:space="preserve"> </w:t>
-      </w:r>
-      <w:r>
-        <w:rPr>
-          <w:bCs/>
-          <w:b/>
-        </w:rPr>
-        <w:t xml:space="preserve">PROVEEDOR</w:t>
-      </w:r>
-      <w:r>
-        <w:t xml:space="preserve"> </w:t>
-      </w:r>
-      <w:r>
-        <w:t xml:space="preserve">- Agencia que crea asistente IA para cliente →</w:t>
-      </w:r>
-      <w:r>
-        <w:t xml:space="preserve"> </w:t>
-      </w:r>
-      <w:r>
-        <w:rPr>
-          <w:bCs/>
-          <w:b/>
-        </w:rPr>
-        <w:t xml:space="preserve">PROVEEDOR</w:t>
-      </w:r>
-    </w:p>
-    <w:p>
-      <w:pPr>
-        <w:pStyle w:val="BodyText"/>
-      </w:pPr>
-      <w:r>
-        <w:rPr>
-          <w:bCs/>
-          <w:b/>
-        </w:rPr>
-        <w:t xml:space="preserve">DEPLOYER/Usuario (Obligaciones menores Art. 26):</w:t>
-      </w:r>
-      <w:r>
-        <w:t xml:space="preserve"> </w:t>
-      </w:r>
-      <w:r>
-        <w:t xml:space="preserve">- Usas sistema IA de terceros SIN modificar</w:t>
-      </w:r>
-      <w:r>
-        <w:t xml:space="preserve"> </w:t>
-      </w:r>
-      <w:r>
-        <w:t xml:space="preserve">- Lo usas para operaciones internas</w:t>
-      </w:r>
-    </w:p>
-    <w:p>
-      <w:pPr>
-        <w:pStyle w:val="BodyText"/>
-      </w:pPr>
-      <w:r>
-        <w:rPr>
-          <w:bCs/>
-          <w:b/>
-        </w:rPr>
-        <w:t xml:space="preserve">Ejemplos deployers:</w:t>
-      </w:r>
-      <w:r>
-        <w:t xml:space="preserve"> </w:t>
-      </w:r>
-      <w:r>
-        <w:t xml:space="preserve">- Empresa que compra Microsoft Copilot y lo usa tal cual →</w:t>
-      </w:r>
-      <w:r>
-        <w:t xml:space="preserve"> </w:t>
-      </w:r>
-      <w:r>
-        <w:rPr>
-          <w:bCs/>
-          <w:b/>
-        </w:rPr>
-        <w:t xml:space="preserve">DEPLOYER</w:t>
-      </w:r>
-      <w:r>
-        <w:t xml:space="preserve"> </w:t>
-      </w:r>
-      <w:r>
-        <w:t xml:space="preserve">- Empresa que usa ChatGPT Enterprise sin customizar →</w:t>
-      </w:r>
-      <w:r>
-        <w:t xml:space="preserve"> </w:t>
-      </w:r>
-      <w:r>
-        <w:rPr>
-          <w:bCs/>
-          <w:b/>
-        </w:rPr>
-        <w:t xml:space="preserve">DEPLOYER</w:t>
-      </w:r>
-    </w:p>
-    <w:p>
-      <w:pPr>
-        <w:pStyle w:val="BodyText"/>
-      </w:pPr>
-      <w:r>
-        <w:rPr>
-          <w:bCs/>
-          <w:b/>
-        </w:rPr>
-        <w:t xml:space="preserve">REGLA GENERAL:</w:t>
-      </w:r>
-      <w:r>
-        <w:t xml:space="preserve"> </w:t>
-      </w:r>
-      <w:r>
-        <w:t xml:space="preserve">Si desarrollas para clientes →</w:t>
-      </w:r>
-      <w:r>
-        <w:t xml:space="preserve"> </w:t>
-      </w:r>
-      <w:r>
-        <w:rPr>
-          <w:bCs/>
-          <w:b/>
-        </w:rPr>
-        <w:t xml:space="preserve">PROVEEDOR</w:t>
-      </w:r>
-      <w:r>
-        <w:t xml:space="preserve"> </w:t>
-      </w:r>
-      <w:r>
-        <w:t xml:space="preserve">(mayoría de casos).</w:t>
-      </w:r>
-    </w:p>
-    <w:p>
-      <w:r>
-        <w:pict>
-          <v:rect style="width:0;height:1.5pt" o:hralign="center" o:hrstd="t" o:hr="t"/>
-        </w:pict>
-      </w:r>
-    </w:p>
-    <w:bookmarkEnd w:id="31"/>
-    <w:bookmarkEnd w:id="32"/>
-    <w:bookmarkStart w:id="36" w:name="mensajes-clave-comerciales"/>
-    <w:p>
-      <w:pPr>
-        <w:pStyle w:val="Heading2"/>
-      </w:pPr>
-      <w:r>
-        <w:t xml:space="preserve">🚨 MENSAJES CLAVE COMERCIALES</w:t>
-      </w:r>
-    </w:p>
-    <w:bookmarkStart w:id="33" w:name="para-ctos-consultoras-tech"/>
-    <w:p>
-      <w:pPr>
-        <w:pStyle w:val="Heading3"/>
-      </w:pPr>
-      <w:r>
-        <w:rPr>
-          <w:bCs/>
-          <w:b/>
-        </w:rPr>
-        <w:t xml:space="preserve">Para CTOs Consultoras Tech:</w:t>
-      </w:r>
-    </w:p>
-    <w:p>
-      <w:pPr>
-        <w:pStyle w:val="BlockText"/>
-      </w:pPr>
-      <w:r>
-        <w:t xml:space="preserve">“</w:t>
-      </w:r>
-      <w:r>
-        <w:t xml:space="preserve">¿Recomendáis a clientes usar adapters (LoRA) sobre Llama?</w:t>
-      </w:r>
-      <w:r>
-        <w:br/>
-      </w:r>
-      <w:r>
-        <w:t xml:space="preserve">✅ SÍ, pero sabiendo que:</w:t>
-      </w:r>
-      <w:r>
-        <w:t xml:space="preserve"> </w:t>
-      </w:r>
-      <w:r>
-        <w:t xml:space="preserve">1. Son proveedores GPAI (Art. 53) desde 2 agosto 2025 (9 meses)</w:t>
-      </w:r>
-      <w:r>
-        <w:t xml:space="preserve"> </w:t>
-      </w:r>
-      <w:r>
-        <w:t xml:space="preserve">2. Necesitan governance adapters desde día 1</w:t>
-      </w:r>
-      <w:r>
-        <w:t xml:space="preserve"> </w:t>
-      </w:r>
-      <w:r>
-        <w:t xml:space="preserve">3. CodeflowX es la ÚNICA plataforma que gobierna esto</w:t>
-      </w:r>
-      <w:r>
-        <w:t xml:space="preserve">”</w:t>
-      </w:r>
-    </w:p>
-    <w:p>
-      <w:r>
-        <w:pict>
-          <v:rect style="width:0;height:1.5pt" o:hralign="center" o:hrstd="t" o:hr="t"/>
-        </w:pict>
-      </w:r>
-    </w:p>
-    <w:bookmarkEnd w:id="33"/>
-    <w:bookmarkStart w:id="34" w:name="para-agencias-marketing"/>
-    <w:p>
-      <w:pPr>
-        <w:pStyle w:val="Heading3"/>
-      </w:pPr>
-      <w:r>
-        <w:rPr>
-          <w:bCs/>
-          <w:b/>
-        </w:rPr>
-        <w:t xml:space="preserve">Para Agencias Marketing:</w:t>
-      </w:r>
-    </w:p>
-    <w:p>
-      <w:pPr>
-        <w:pStyle w:val="BlockText"/>
-      </w:pPr>
-      <w:r>
-        <w:t xml:space="preserve">“¿Tu cliente usa chatbot con GPT-4 en su web?</w:t>
-      </w:r>
-      <w:r>
-        <w:br/>
-      </w:r>
-      <w:r>
-        <w:t xml:space="preserve">✅ Te afecta:</w:t>
-      </w:r>
-      <w:r>
-        <w:t xml:space="preserve"> </w:t>
-      </w:r>
-      <w:r>
-        <w:t xml:space="preserve">- Art. 52: Transparencia (usuario sabe que es IA)</w:t>
-      </w:r>
-      <w:r>
-        <w:t xml:space="preserve"> </w:t>
-      </w:r>
-      <w:r>
-        <w:t xml:space="preserve">- Art. 19: Logs conversaciones (auditable)</w:t>
-      </w:r>
-      <w:r>
-        <w:t xml:space="preserve"> </w:t>
-      </w:r>
-      <w:r>
-        <w:t xml:space="preserve">- Si vende productos financieros → Alto riesgo (Art. 6-27)</w:t>
-      </w:r>
-    </w:p>
-    <w:p>
-      <w:pPr>
-        <w:pStyle w:val="BlockText"/>
-      </w:pPr>
-      <w:r>
-        <w:t xml:space="preserve">CodeflowX automatiza compliance, tú solo vendes.”</w:t>
-      </w:r>
-    </w:p>
-    <w:p>
-      <w:r>
-        <w:pict>
-          <v:rect style="width:0;height:1.5pt" o:hralign="center" o:hrstd="t" o:hr="t"/>
-        </w:pict>
-      </w:r>
-    </w:p>
-    <w:bookmarkEnd w:id="34"/>
-    <w:bookmarkStart w:id="35" w:name="para-abogadoscompliance"/>
-    <w:p>
-      <w:pPr>
-        <w:pStyle w:val="Heading3"/>
-      </w:pPr>
-      <w:r>
-        <w:rPr>
-          <w:bCs/>
-          <w:b/>
-        </w:rPr>
-        <w:t xml:space="preserve">Para Abogados/Compliance:</w:t>
-      </w:r>
-    </w:p>
-    <w:p>
-      <w:pPr>
-        <w:pStyle w:val="BlockText"/>
-      </w:pPr>
-      <w:r>
-        <w:t xml:space="preserve">“Cliente hace fine-tuning de Llama con docs legales:</w:t>
-      </w:r>
-      <w:r>
-        <w:br/>
-      </w:r>
-      <w:r>
-        <w:t xml:space="preserve">1. Proveedor GPAI (Art. 53) → Deadline 2 agosto 2025</w:t>
-      </w:r>
-      <w:r>
-        <w:t xml:space="preserve"> </w:t>
-      </w:r>
-      <w:r>
-        <w:t xml:space="preserve">2. Sistema alto riesgo legal (Anexo III.8.a) → Deadline 2 agosto 2027</w:t>
-      </w:r>
-      <w:r>
-        <w:t xml:space="preserve"> </w:t>
-      </w:r>
-      <w:r>
-        <w:t xml:space="preserve">3.</w:t>
-      </w:r>
-      <w:r>
-        <w:t xml:space="preserve"> </w:t>
-      </w:r>
-      <w:r>
-        <w:rPr>
-          <w:bCs/>
-          <w:b/>
-        </w:rPr>
-        <w:t xml:space="preserve">Doble obligación, doble riesgo</w:t>
-      </w:r>
-    </w:p>
-    <w:p>
-      <w:pPr>
-        <w:pStyle w:val="BlockText"/>
-      </w:pPr>
-      <w:r>
-        <w:t xml:space="preserve">CodeflowX cubre ambas (único en mercado).”</w:t>
-      </w:r>
-    </w:p>
-    <w:p>
-      <w:r>
-        <w:pict>
-          <v:rect style="width:0;height:1.5pt" o:hralign="center" o:hrstd="t" o:hr="t"/>
-        </w:pict>
-      </w:r>
-    </w:p>
-    <w:bookmarkEnd w:id="35"/>
-    <w:bookmarkEnd w:id="36"/>
-    <w:bookmarkStart w:id="40" w:name="priorización-por-urgencia"/>
-    <w:p>
-      <w:pPr>
-        <w:pStyle w:val="Heading2"/>
-      </w:pPr>
-      <w:r>
-        <w:t xml:space="preserve">📊 PRIORIZACIÓN POR URGENCIA</w:t>
-      </w:r>
-    </w:p>
-    <w:bookmarkStart w:id="37" w:name="urgente-2-agosto-2025---9-meses"/>
-    <w:p>
-      <w:pPr>
-        <w:pStyle w:val="Heading3"/>
-      </w:pPr>
-      <w:r>
-        <w:rPr>
-          <w:bCs/>
-          <w:b/>
-        </w:rPr>
-        <w:t xml:space="preserve">URGENTE (2 agosto 2025 - 9 meses):</w:t>
-      </w:r>
-    </w:p>
-    <w:p>
-      <w:pPr>
-        <w:pStyle w:val="FirstParagraph"/>
-      </w:pPr>
-      <w:r>
-        <w:t xml:space="preserve">Si haces</w:t>
-      </w:r>
-      <w:r>
-        <w:t xml:space="preserve"> </w:t>
-      </w:r>
-      <w:r>
-        <w:rPr>
-          <w:bCs/>
-          <w:b/>
-        </w:rPr>
-        <w:t xml:space="preserve">CUALQUIERA</w:t>
-      </w:r>
-      <w:r>
-        <w:t xml:space="preserve"> </w:t>
-      </w:r>
-      <w:r>
-        <w:t xml:space="preserve">de esto:</w:t>
-      </w:r>
-      <w:r>
-        <w:t xml:space="preserve"> </w:t>
-      </w:r>
-      <w:r>
-        <w:t xml:space="preserve">- ✅ Fine-tuning modelos</w:t>
-      </w:r>
-      <w:r>
-        <w:t xml:space="preserve"> </w:t>
-      </w:r>
-      <w:r>
-        <w:t xml:space="preserve">- ✅ Adapters (LoRA, QLoRA, etc.)</w:t>
-      </w:r>
-      <w:r>
-        <w:t xml:space="preserve"> </w:t>
-      </w:r>
-      <w:r>
-        <w:t xml:space="preserve">- ✅ Merge de modelos</w:t>
-      </w:r>
-      <w:r>
-        <w:t xml:space="preserve"> </w:t>
-      </w:r>
-      <w:r>
-        <w:t xml:space="preserve">- ✅ Distribución modelos cuantizados</w:t>
-      </w:r>
-    </w:p>
-    <w:p>
-      <w:pPr>
-        <w:pStyle w:val="BodyText"/>
-      </w:pPr>
-      <w:r>
-        <w:t xml:space="preserve">→</w:t>
-      </w:r>
-      <w:r>
-        <w:t xml:space="preserve"> </w:t>
-      </w:r>
-      <w:r>
-        <w:rPr>
-          <w:bCs/>
-          <w:b/>
-        </w:rPr>
-        <w:t xml:space="preserve">ERES PROVEEDOR GPAI</w:t>
-      </w:r>
-      <w:r>
-        <w:t xml:space="preserve"> </w:t>
-      </w:r>
-      <w:r>
-        <w:t xml:space="preserve">→ Art. 53 + Anexo XI + Anexo XII</w:t>
-      </w:r>
-    </w:p>
-    <w:p>
-      <w:r>
-        <w:pict>
-          <v:rect style="width:0;height:1.5pt" o:hralign="center" o:hrstd="t" o:hr="t"/>
-        </w:pict>
-      </w:r>
-    </w:p>
-    <w:bookmarkEnd w:id="37"/>
-    <w:bookmarkStart w:id="38" w:name="importante-2-agosto-2026---21-meses"/>
-    <w:p>
-      <w:pPr>
-        <w:pStyle w:val="Heading3"/>
-      </w:pPr>
-      <w:r>
-        <w:rPr>
-          <w:bCs/>
-          <w:b/>
-        </w:rPr>
-        <w:t xml:space="preserve">IMPORTANTE (2 agosto 2026 - 21 meses):</w:t>
-      </w:r>
-    </w:p>
-    <w:p>
-      <w:pPr>
-        <w:pStyle w:val="FirstParagraph"/>
-      </w:pPr>
-      <w:r>
-        <w:t xml:space="preserve">Aplicación general:</w:t>
-      </w:r>
-      <w:r>
-        <w:t xml:space="preserve"> </w:t>
-      </w:r>
-      <w:r>
-        <w:t xml:space="preserve">- ✅ Chatbots (Art. 52 transparencia mínimo)</w:t>
-      </w:r>
-      <w:r>
-        <w:t xml:space="preserve"> </w:t>
-      </w:r>
-      <w:r>
-        <w:t xml:space="preserve">- ✅ Sistemas IA no alto riesgo</w:t>
-      </w:r>
-      <w:r>
-        <w:t xml:space="preserve"> </w:t>
-      </w:r>
-      <w:r>
-        <w:t xml:space="preserve">- ✅ Contenido generado por IA</w:t>
-      </w:r>
-    </w:p>
-    <w:p>
-      <w:r>
-        <w:pict>
-          <v:rect style="width:0;height:1.5pt" o:hralign="center" o:hrstd="t" o:hr="t"/>
-        </w:pict>
-      </w:r>
-    </w:p>
-    <w:bookmarkEnd w:id="38"/>
-    <w:bookmarkStart w:id="39" w:name="Xb1d57399391dc06963dfac7a80f62206234b32c"/>
-    <w:p>
-      <w:pPr>
-        <w:pStyle w:val="Heading3"/>
-      </w:pPr>
-      <w:r>
-        <w:rPr>
-          <w:bCs/>
-          <w:b/>
-        </w:rPr>
-        <w:t xml:space="preserve">CRÍTICO SECTORES REGULADOS (2 agosto 2027 - 32 meses):</w:t>
-      </w:r>
-    </w:p>
-    <w:p>
-      <w:pPr>
-        <w:pStyle w:val="FirstParagraph"/>
-      </w:pPr>
-      <w:r>
-        <w:t xml:space="preserve">Sistemas alto riesgo (Anexo III):</w:t>
-      </w:r>
-      <w:r>
-        <w:t xml:space="preserve"> </w:t>
-      </w:r>
-      <w:r>
-        <w:t xml:space="preserve">- ✅ RRHH (screening CVs, evaluación desempeño)</w:t>
-      </w:r>
-      <w:r>
-        <w:t xml:space="preserve"> </w:t>
-      </w:r>
-      <w:r>
-        <w:t xml:space="preserve">- ✅ Financiero (scoring crediticio, seguros)</w:t>
-      </w:r>
-      <w:r>
-        <w:t xml:space="preserve"> </w:t>
-      </w:r>
-      <w:r>
-        <w:t xml:space="preserve">- ✅ Salud (diagnóstico, análisis imágenes)</w:t>
-      </w:r>
-      <w:r>
-        <w:t xml:space="preserve"> </w:t>
-      </w:r>
-      <w:r>
-        <w:t xml:space="preserve">- ✅ Legal (sistemas decisión judicial)</w:t>
-      </w:r>
-      <w:r>
-        <w:t xml:space="preserve"> </w:t>
-      </w:r>
-      <w:r>
-        <w:t xml:space="preserve">- ✅ Público (administración, servicios esenciales)</w:t>
-      </w:r>
-    </w:p>
-    <w:p>
-      <w:pPr>
-        <w:pStyle w:val="BodyText"/>
-      </w:pPr>
-      <w:r>
-        <w:t xml:space="preserve">→</w:t>
-      </w:r>
-      <w:r>
-        <w:t xml:space="preserve"> </w:t>
-      </w:r>
-      <w:r>
-        <w:rPr>
-          <w:bCs/>
-          <w:b/>
-        </w:rPr>
-        <w:t xml:space="preserve">Art. 6-27 COMPLETO</w:t>
-      </w:r>
-    </w:p>
-    <w:p>
-      <w:r>
-        <w:pict>
-          <v:rect style="width:0;height:1.5pt" o:hralign="center" o:hrstd="t" o:hr="t"/>
-        </w:pict>
-      </w:r>
-    </w:p>
-    <w:bookmarkEnd w:id="39"/>
-    <w:bookmarkEnd w:id="40"/>
-    <w:bookmarkStart w:id="41" w:name="diferenciador-codeflowx"/>
-    <w:p>
-      <w:pPr>
-        <w:pStyle w:val="Heading2"/>
-      </w:pPr>
-      <w:r>
-        <w:t xml:space="preserve">💡 DIFERENCIADOR CODEFLOWX</w:t>
-      </w:r>
-    </w:p>
-    <w:p>
-      <w:pPr>
-        <w:pStyle w:val="FirstParagraph"/>
-      </w:pPr>
-      <w:r>
-        <w:rPr>
-          <w:bCs/>
-          <w:b/>
-        </w:rPr>
-        <w:t xml:space="preserve">Competencia (herramientas observabilidad):</w:t>
-      </w:r>
-      <w:r>
-        <w:t xml:space="preserve"> </w:t>
-      </w:r>
-      <w:r>
-        <w:t xml:space="preserve">- ❌ NO gobierna adapters</w:t>
-      </w:r>
-      <w:r>
-        <w:t xml:space="preserve"> </w:t>
-      </w:r>
-      <w:r>
-        <w:t xml:space="preserve">- ❌ NO gobierna fine-tuning</w:t>
-      </w:r>
-      <w:r>
-        <w:t xml:space="preserve"> </w:t>
-      </w:r>
-      <w:r>
-        <w:t xml:space="preserve">- ❌ NO gobierna merge modelos</w:t>
-      </w:r>
-      <w:r>
-        <w:t xml:space="preserve"> </w:t>
-      </w:r>
-      <w:r>
-        <w:t xml:space="preserve">- ❌ NO genera Anexo XI/XII</w:t>
-      </w:r>
-      <w:r>
-        <w:t xml:space="preserve"> </w:t>
-      </w:r>
-      <w:r>
-        <w:t xml:space="preserve">- ❌ NO tracking copyright compliance</w:t>
-      </w:r>
-    </w:p>
-    <w:p>
-      <w:pPr>
-        <w:pStyle w:val="BodyText"/>
-      </w:pPr>
-      <w:r>
-        <w:rPr>
-          <w:bCs/>
-          <w:b/>
-        </w:rPr>
-        <w:t xml:space="preserve">CodeflowX (governance completo):</w:t>
-      </w:r>
-      <w:r>
-        <w:t xml:space="preserve"> </w:t>
-      </w:r>
-      <w:r>
-        <w:t xml:space="preserve">- ✅ Gobierna adapters (versiones, evaluación, Anexo XI)</w:t>
-      </w:r>
-      <w:r>
-        <w:t xml:space="preserve"> </w:t>
-      </w:r>
-      <w:r>
-        <w:t xml:space="preserve">- ✅ Gobierna fine-tuning (datos, evaluación, Anexo XI)</w:t>
-      </w:r>
-      <w:r>
-        <w:t xml:space="preserve"> </w:t>
-      </w:r>
-      <w:r>
-        <w:t xml:space="preserve">- ✅ Gobierna merge (tracking origen, capacidades, Anexo XI)</w:t>
-      </w:r>
-      <w:r>
-        <w:t xml:space="preserve"> </w:t>
-      </w:r>
-      <w:r>
-        <w:t xml:space="preserve">- ✅ Auto-genera Anexo XI/XII (documentación técnica)</w:t>
-      </w:r>
-      <w:r>
-        <w:t xml:space="preserve"> </w:t>
-      </w:r>
-      <w:r>
-        <w:t xml:space="preserve">- ✅ Política copyright automatizada (Anexo XII)</w:t>
-      </w:r>
-      <w:r>
-        <w:t xml:space="preserve"> </w:t>
-      </w:r>
-      <w:r>
-        <w:t xml:space="preserve">- ✅ Governance modelos + prompts + agentes + RAG + datos</w:t>
-      </w:r>
-    </w:p>
-    <w:p>
-      <w:pPr>
-        <w:pStyle w:val="BodyText"/>
-      </w:pPr>
-      <w:r>
-        <w:rPr>
-          <w:bCs/>
-          <w:b/>
-        </w:rPr>
-        <w:t xml:space="preserve">ÚNICO en mercado con governance completo GPAI (Art. 53) + Sistemas Alto Riesgo (Art. 6-27).</w:t>
-      </w:r>
-    </w:p>
-    <w:p>
-      <w:r>
-        <w:pict>
-          <v:rect style="width:0;height:1.5pt" o:hralign="center" o:hrstd="t" o:hr="t"/>
-        </w:pict>
-      </w:r>
-    </w:p>
-    <w:bookmarkEnd w:id="41"/>
-    <w:bookmarkStart w:id="42" w:name="próximos-pasos"/>
-    <w:p>
-      <w:pPr>
-        <w:pStyle w:val="Heading2"/>
-      </w:pPr>
-      <w:r>
-        <w:t xml:space="preserve">📞 PRÓXIMOS PASOS</w:t>
-      </w:r>
-    </w:p>
-    <w:p>
-      <w:pPr>
-        <w:pStyle w:val="FirstParagraph"/>
-      </w:pPr>
-      <w:r>
-        <w:rPr>
-          <w:bCs/>
-          <w:b/>
-        </w:rPr>
-        <w:t xml:space="preserve">¿Tienes dudas sobre tu caso específico?</w:t>
       </w:r>
     </w:p>
     <w:p>
@@ -4013,13 +3080,49 @@
           <w:bCs/>
           <w:b/>
         </w:rPr>
-        <w:t xml:space="preserve">Demo técnica 30 min:</w:t>
-      </w:r>
-      <w:r>
-        <w:t xml:space="preserve"> </w:t>
-      </w:r>
-      <w:r>
-        <w:t xml:space="preserve">Analizamos tu stack, te decimos qué obligaciones tienes</w:t>
+        <w:t xml:space="preserve">Art. 13:</w:t>
+      </w:r>
+      <w:r>
+        <w:t xml:space="preserve"> </w:t>
+      </w:r>
+      <w:r>
+        <w:t xml:space="preserve">Transparencia decisiones</w:t>
+      </w:r>
+    </w:p>
+    <w:p>
+      <w:pPr>
+        <w:numPr>
+          <w:ilvl w:val="1"/>
+          <w:numId w:val="1005"/>
+        </w:numPr>
+        <w:pStyle w:val="Compact"/>
+      </w:pPr>
+      <w:r>
+        <w:t xml:space="preserve">Explicar POR QUÉ el agente tomó esa decisión</w:t>
+      </w:r>
+    </w:p>
+    <w:p>
+      <w:pPr>
+        <w:numPr>
+          <w:ilvl w:val="1"/>
+          <w:numId w:val="1005"/>
+        </w:numPr>
+        <w:pStyle w:val="Compact"/>
+      </w:pPr>
+      <w:r>
+        <w:t xml:space="preserve">Qué tools usó</w:t>
+      </w:r>
+    </w:p>
+    <w:p>
+      <w:pPr>
+        <w:numPr>
+          <w:ilvl w:val="1"/>
+          <w:numId w:val="1005"/>
+        </w:numPr>
+        <w:pStyle w:val="Compact"/>
+      </w:pPr>
+      <w:r>
+        <w:t xml:space="preserve">Qué datos consultó</w:t>
       </w:r>
     </w:p>
     <w:p>
@@ -4035,35 +3138,49 @@
           <w:bCs/>
           <w:b/>
         </w:rPr>
-        <w:t xml:space="preserve">Evaluación compliance:</w:t>
-      </w:r>
-      <w:r>
-        <w:t xml:space="preserve"> </w:t>
-      </w:r>
-      <w:r>
-        <w:t xml:space="preserve">Checklist personalizado según tu caso</w:t>
+        <w:t xml:space="preserve">Art. 19:</w:t>
+      </w:r>
+      <w:r>
+        <w:t xml:space="preserve"> </w:t>
+      </w:r>
+      <w:r>
+        <w:t xml:space="preserve">Logs inmutables</w:t>
       </w:r>
     </w:p>
     <w:p>
       <w:pPr>
         <w:numPr>
-          <w:ilvl w:val="0"/>
-          <w:numId w:val="1004"/>
+          <w:ilvl w:val="1"/>
+          <w:numId w:val="1006"/>
         </w:numPr>
         <w:pStyle w:val="Compact"/>
       </w:pPr>
       <w:r>
-        <w:rPr>
-          <w:bCs/>
-          <w:b/>
-        </w:rPr>
-        <w:t xml:space="preserve">Roadmap implementación:</w:t>
-      </w:r>
-      <w:r>
-        <w:t xml:space="preserve"> </w:t>
-      </w:r>
-      <w:r>
-        <w:t xml:space="preserve">Plan paso a paso para cumplir deadlines</w:t>
+        <w:t xml:space="preserve">Todas las decisiones del agente</w:t>
+      </w:r>
+    </w:p>
+    <w:p>
+      <w:pPr>
+        <w:numPr>
+          <w:ilvl w:val="1"/>
+          <w:numId w:val="1006"/>
+        </w:numPr>
+        <w:pStyle w:val="Compact"/>
+      </w:pPr>
+      <w:r>
+        <w:t xml:space="preserve">Acciones ejecutadas</w:t>
+      </w:r>
+    </w:p>
+    <w:p>
+      <w:pPr>
+        <w:numPr>
+          <w:ilvl w:val="1"/>
+          <w:numId w:val="1006"/>
+        </w:numPr>
+        <w:pStyle w:val="Compact"/>
+      </w:pPr>
+      <w:r>
+        <w:t xml:space="preserve">Intervenciones humanas</w:t>
       </w:r>
     </w:p>
     <w:p>
@@ -4075,19 +3192,71 @@
           <w:bCs/>
           <w:b/>
         </w:rPr>
-        <w:t xml:space="preserve">Contacto:</w:t>
-      </w:r>
-      <w:r>
-        <w:br/>
-      </w:r>
-      <w:r>
-        <w:t xml:space="preserve">Email: tech@codeflowx.com</w:t>
-      </w:r>
-      <w:r>
-        <w:br/>
-      </w:r>
-      <w:r>
-        <w:t xml:space="preserve">Calendly: [link]</w:t>
+        <w:t xml:space="preserve">Si agente es alto riesgo (ej: agente que aprueba créditos):</w:t>
+      </w:r>
+      <w:r>
+        <w:t xml:space="preserve"> </w:t>
+      </w:r>
+      <w:r>
+        <w:t xml:space="preserve">-</w:t>
+      </w:r>
+      <w:r>
+        <w:t xml:space="preserve"> </w:t>
+      </w:r>
+      <w:r>
+        <w:rPr>
+          <w:bCs/>
+          <w:b/>
+        </w:rPr>
+        <w:t xml:space="preserve">Fecha límite:</w:t>
+      </w:r>
+      <w:r>
+        <w:t xml:space="preserve"> </w:t>
+      </w:r>
+      <w:r>
+        <w:t xml:space="preserve">2 agosto 2027</w:t>
+      </w:r>
+      <w:r>
+        <w:t xml:space="preserve"> </w:t>
+      </w:r>
+      <w:r>
+        <w:t xml:space="preserve">- Art. 6-27 completo</w:t>
+      </w:r>
+    </w:p>
+    <w:p>
+      <w:pPr>
+        <w:pStyle w:val="BodyText"/>
+      </w:pPr>
+      <w:r>
+        <w:rPr>
+          <w:bCs/>
+          <w:b/>
+        </w:rPr>
+        <w:t xml:space="preserve">CodeflowX gobierna agentes:</w:t>
+      </w:r>
+      <w:r>
+        <w:t xml:space="preserve"> </w:t>
+      </w:r>
+      <w:r>
+        <w:t xml:space="preserve">- HITL integrado (stop, approve, reject)</w:t>
+      </w:r>
+      <w:r>
+        <w:t xml:space="preserve"> </w:t>
+      </w:r>
+      <w:r>
+        <w:t xml:space="preserve">- Explicabilidad decisiones (AI Interpreter)</w:t>
+      </w:r>
+      <w:r>
+        <w:t xml:space="preserve"> </w:t>
+      </w:r>
+      <w:r>
+        <w:t xml:space="preserve">- Logs inmutables automáticos</w:t>
+      </w:r>
+      <w:r>
+        <w:t xml:space="preserve"> </w:t>
+      </w:r>
+      <w:r>
+        <w:t xml:space="preserve">- Monitoring autonomía (drift detection)</w:t>
       </w:r>
     </w:p>
     <w:p>
@@ -4097,36 +3266,170 @@
         </w:pict>
       </w:r>
     </w:p>
+    <w:bookmarkEnd w:id="33"/>
+    <w:bookmarkStart w:id="34" w:name="Xe3d59b7884c1ca60b80b499badfc000b9f1d9f7"/>
+    <w:p>
+      <w:pPr>
+        <w:pStyle w:val="Heading3"/>
+      </w:pPr>
+      <w:r>
+        <w:rPr>
+          <w:bCs/>
+          <w:b/>
+        </w:rPr>
+        <w:t xml:space="preserve">P9: ¿Sistemas NO alto riesgo tienen obligaciones?</w:t>
+      </w:r>
+    </w:p>
     <w:p>
       <w:pPr>
         <w:pStyle w:val="FirstParagraph"/>
       </w:pPr>
       <w:r>
-        <w:rPr>
-          <w:bCs/>
-          <w:b/>
-        </w:rPr>
-        <w:t xml:space="preserve">CodeflowX - De España para Europa</w:t>
-      </w:r>
-      <w:r>
-        <w:br/>
-      </w:r>
-      <w:r>
-        <w:rPr>
-          <w:bCs/>
-          <w:b/>
-        </w:rPr>
-        <w:t xml:space="preserve">La única plataforma que gobierna adapters, fine-tuning, merge, RAG, agentes y prompts</w:t>
-      </w:r>
-      <w:r>
-        <w:br/>
-      </w:r>
-      <w:r>
-        <w:rPr>
-          <w:bCs/>
-          <w:b/>
-        </w:rPr>
-        <w:t xml:space="preserve">Compliance completo GPAI (Art. 53) + Alto Riesgo (Art. 6-27)</w:t>
+        <w:t xml:space="preserve">✅</w:t>
+      </w:r>
+      <w:r>
+        <w:t xml:space="preserve"> </w:t>
+      </w:r>
+      <w:r>
+        <w:rPr>
+          <w:bCs/>
+          <w:b/>
+        </w:rPr>
+        <w:t xml:space="preserve">SÍ, mínimo Art. 52 (transparencia).</w:t>
+      </w:r>
+    </w:p>
+    <w:p>
+      <w:pPr>
+        <w:pStyle w:val="BodyText"/>
+      </w:pPr>
+      <w:r>
+        <w:rPr>
+          <w:bCs/>
+          <w:b/>
+        </w:rPr>
+        <w:t xml:space="preserve">Obligaciones mínimas CUALQUIER sistema IA:</w:t>
+      </w:r>
+    </w:p>
+    <w:p>
+      <w:pPr>
+        <w:pStyle w:val="BodyText"/>
+      </w:pPr>
+      <w:r>
+        <w:rPr>
+          <w:bCs/>
+          <w:b/>
+        </w:rPr>
+        <w:t xml:space="preserve">Art. 52 - Transparencia:</w:t>
+      </w:r>
+      <w:r>
+        <w:t xml:space="preserve"> </w:t>
+      </w:r>
+      <w:r>
+        <w:t xml:space="preserve">- Si chatbot → Usuario debe saber que habla con IA, no humano</w:t>
+      </w:r>
+      <w:r>
+        <w:t xml:space="preserve"> </w:t>
+      </w:r>
+      <w:r>
+        <w:t xml:space="preserve">- Si contenido generado por IA → Debe estar identificado</w:t>
+      </w:r>
+      <w:r>
+        <w:t xml:space="preserve"> </w:t>
+      </w:r>
+      <w:r>
+        <w:t xml:space="preserve">- Si deep fake → Obligatorio indicar que es manipulado</w:t>
+      </w:r>
+    </w:p>
+    <w:p>
+      <w:pPr>
+        <w:pStyle w:val="BodyText"/>
+      </w:pPr>
+      <w:r>
+        <w:rPr>
+          <w:bCs/>
+          <w:b/>
+        </w:rPr>
+        <w:t xml:space="preserve">Fecha límite:</w:t>
+      </w:r>
+      <w:r>
+        <w:t xml:space="preserve"> </w:t>
+      </w:r>
+      <w:r>
+        <w:t xml:space="preserve">2 agosto 2026 (aplicación general)</w:t>
+      </w:r>
+    </w:p>
+    <w:p>
+      <w:pPr>
+        <w:pStyle w:val="BodyText"/>
+      </w:pPr>
+      <w:r>
+        <w:rPr>
+          <w:bCs/>
+          <w:b/>
+        </w:rPr>
+        <w:t xml:space="preserve">Ejemplo chatbot web ecommerce:</w:t>
+      </w:r>
+      <w:r>
+        <w:t xml:space="preserve"> </w:t>
+      </w:r>
+      <w:r>
+        <w:t xml:space="preserve">- NO alto riesgo (solo vende productos)</w:t>
+      </w:r>
+      <w:r>
+        <w:t xml:space="preserve"> </w:t>
+      </w:r>
+      <w:r>
+        <w:t xml:space="preserve">- Pero</w:t>
+      </w:r>
+      <w:r>
+        <w:t xml:space="preserve"> </w:t>
+      </w:r>
+      <w:r>
+        <w:rPr>
+          <w:bCs/>
+          <w:b/>
+        </w:rPr>
+        <w:t xml:space="preserve">SÍ Art. 52</w:t>
+      </w:r>
+      <w:r>
+        <w:t xml:space="preserve"> </w:t>
+      </w:r>
+      <w:r>
+        <w:t xml:space="preserve">→</w:t>
+      </w:r>
+      <w:r>
+        <w:t xml:space="preserve"> </w:t>
+      </w:r>
+      <w:r>
+        <w:t xml:space="preserve">“</w:t>
+      </w:r>
+      <w:r>
+        <w:t xml:space="preserve">Estás hablando con un asistente virtual IA</w:t>
+      </w:r>
+      <w:r>
+        <w:t xml:space="preserve">”</w:t>
+      </w:r>
+      <w:r>
+        <w:t xml:space="preserve"> </w:t>
+      </w:r>
+      <w:r>
+        <w:t xml:space="preserve">-</w:t>
+      </w:r>
+      <w:r>
+        <w:t xml:space="preserve"> </w:t>
+      </w:r>
+      <w:r>
+        <w:rPr>
+          <w:bCs/>
+          <w:b/>
+        </w:rPr>
+        <w:t xml:space="preserve">SÍ logs</w:t>
+      </w:r>
+      <w:r>
+        <w:t xml:space="preserve"> </w:t>
+      </w:r>
+      <w:r>
+        <w:t xml:space="preserve">(buena práctica para RGPD)</w:t>
       </w:r>
     </w:p>
     <w:p>
@@ -4136,6 +3439,1002 @@
         </w:pict>
       </w:r>
     </w:p>
+    <w:bookmarkEnd w:id="34"/>
+    <w:bookmarkStart w:id="35" w:name="p10-soy-proveedor-o-deployerusuario"/>
+    <w:p>
+      <w:pPr>
+        <w:pStyle w:val="Heading3"/>
+      </w:pPr>
+      <w:r>
+        <w:rPr>
+          <w:bCs/>
+          <w:b/>
+        </w:rPr>
+        <w:t xml:space="preserve">P10: ¿Soy</w:t>
+      </w:r>
+      <w:r>
+        <w:rPr>
+          <w:bCs/>
+          <w:b/>
+        </w:rPr>
+        <w:t xml:space="preserve"> </w:t>
+      </w:r>
+      <w:r>
+        <w:rPr>
+          <w:bCs/>
+          <w:b/>
+        </w:rPr>
+        <w:t xml:space="preserve">“</w:t>
+      </w:r>
+      <w:r>
+        <w:rPr>
+          <w:bCs/>
+          <w:b/>
+        </w:rPr>
+        <w:t xml:space="preserve">proveedor</w:t>
+      </w:r>
+      <w:r>
+        <w:rPr>
+          <w:bCs/>
+          <w:b/>
+        </w:rPr>
+        <w:t xml:space="preserve">”</w:t>
+      </w:r>
+      <w:r>
+        <w:rPr>
+          <w:bCs/>
+          <w:b/>
+        </w:rPr>
+        <w:t xml:space="preserve"> </w:t>
+      </w:r>
+      <w:r>
+        <w:rPr>
+          <w:bCs/>
+          <w:b/>
+        </w:rPr>
+        <w:t xml:space="preserve">o</w:t>
+      </w:r>
+      <w:r>
+        <w:rPr>
+          <w:bCs/>
+          <w:b/>
+        </w:rPr>
+        <w:t xml:space="preserve"> </w:t>
+      </w:r>
+      <w:r>
+        <w:rPr>
+          <w:bCs/>
+          <w:b/>
+        </w:rPr>
+        <w:t xml:space="preserve">“</w:t>
+      </w:r>
+      <w:r>
+        <w:rPr>
+          <w:bCs/>
+          <w:b/>
+        </w:rPr>
+        <w:t xml:space="preserve">deployer/usuario</w:t>
+      </w:r>
+      <w:r>
+        <w:rPr>
+          <w:bCs/>
+          <w:b/>
+        </w:rPr>
+        <w:t xml:space="preserve">”</w:t>
+      </w:r>
+      <w:r>
+        <w:rPr>
+          <w:bCs/>
+          <w:b/>
+        </w:rPr>
+        <w:t xml:space="preserve">?</w:t>
+      </w:r>
+    </w:p>
+    <w:p>
+      <w:pPr>
+        <w:pStyle w:val="FirstParagraph"/>
+      </w:pPr>
+      <w:r>
+        <w:rPr>
+          <w:bCs/>
+          <w:b/>
+        </w:rPr>
+        <w:t xml:space="preserve">PROVEEDOR (Obligaciones completas Art. 16-27):</w:t>
+      </w:r>
+      <w:r>
+        <w:t xml:space="preserve"> </w:t>
+      </w:r>
+      <w:r>
+        <w:t xml:space="preserve">- Desarrollas sistema IA (aunque uses modelos terceros)</w:t>
+      </w:r>
+      <w:r>
+        <w:t xml:space="preserve"> </w:t>
+      </w:r>
+      <w:r>
+        <w:t xml:space="preserve">- Modificas sistema IA existente sustancialmente</w:t>
+      </w:r>
+      <w:r>
+        <w:t xml:space="preserve"> </w:t>
+      </w:r>
+      <w:r>
+        <w:t xml:space="preserve">- Pones tu nombre/marca en el sistema</w:t>
+      </w:r>
+      <w:r>
+        <w:t xml:space="preserve"> </w:t>
+      </w:r>
+      <w:r>
+        <w:t xml:space="preserve">- Lo vendes/distribuyes a clientes</w:t>
+      </w:r>
+    </w:p>
+    <w:p>
+      <w:pPr>
+        <w:pStyle w:val="BodyText"/>
+      </w:pPr>
+      <w:r>
+        <w:rPr>
+          <w:bCs/>
+          <w:b/>
+        </w:rPr>
+        <w:t xml:space="preserve">Ejemplos proveedores:</w:t>
+      </w:r>
+      <w:r>
+        <w:t xml:space="preserve"> </w:t>
+      </w:r>
+      <w:r>
+        <w:t xml:space="preserve">- Consultora que crea chatbot GPT-4 para banco →</w:t>
+      </w:r>
+      <w:r>
+        <w:t xml:space="preserve"> </w:t>
+      </w:r>
+      <w:r>
+        <w:rPr>
+          <w:bCs/>
+          <w:b/>
+        </w:rPr>
+        <w:t xml:space="preserve">PROVEEDOR</w:t>
+      </w:r>
+      <w:r>
+        <w:t xml:space="preserve"> </w:t>
+      </w:r>
+      <w:r>
+        <w:t xml:space="preserve">- Startup que hace RAG con Llama para SaaS →</w:t>
+      </w:r>
+      <w:r>
+        <w:t xml:space="preserve"> </w:t>
+      </w:r>
+      <w:r>
+        <w:rPr>
+          <w:bCs/>
+          <w:b/>
+        </w:rPr>
+        <w:t xml:space="preserve">PROVEEDOR</w:t>
+      </w:r>
+      <w:r>
+        <w:t xml:space="preserve"> </w:t>
+      </w:r>
+      <w:r>
+        <w:t xml:space="preserve">- Agencia que crea asistente IA para cliente →</w:t>
+      </w:r>
+      <w:r>
+        <w:t xml:space="preserve"> </w:t>
+      </w:r>
+      <w:r>
+        <w:rPr>
+          <w:bCs/>
+          <w:b/>
+        </w:rPr>
+        <w:t xml:space="preserve">PROVEEDOR</w:t>
+      </w:r>
+    </w:p>
+    <w:p>
+      <w:pPr>
+        <w:pStyle w:val="BodyText"/>
+      </w:pPr>
+      <w:r>
+        <w:rPr>
+          <w:bCs/>
+          <w:b/>
+        </w:rPr>
+        <w:t xml:space="preserve">DEPLOYER/Usuario (Obligaciones menores Art. 26):</w:t>
+      </w:r>
+      <w:r>
+        <w:t xml:space="preserve"> </w:t>
+      </w:r>
+      <w:r>
+        <w:t xml:space="preserve">- Usas sistema IA de terceros SIN modificar</w:t>
+      </w:r>
+      <w:r>
+        <w:t xml:space="preserve"> </w:t>
+      </w:r>
+      <w:r>
+        <w:t xml:space="preserve">- Lo usas para operaciones internas</w:t>
+      </w:r>
+    </w:p>
+    <w:p>
+      <w:pPr>
+        <w:pStyle w:val="BodyText"/>
+      </w:pPr>
+      <w:r>
+        <w:rPr>
+          <w:bCs/>
+          <w:b/>
+        </w:rPr>
+        <w:t xml:space="preserve">Ejemplos deployers:</w:t>
+      </w:r>
+      <w:r>
+        <w:t xml:space="preserve"> </w:t>
+      </w:r>
+      <w:r>
+        <w:t xml:space="preserve">- Empresa que compra Microsoft Copilot y lo usa tal cual →</w:t>
+      </w:r>
+      <w:r>
+        <w:t xml:space="preserve"> </w:t>
+      </w:r>
+      <w:r>
+        <w:rPr>
+          <w:bCs/>
+          <w:b/>
+        </w:rPr>
+        <w:t xml:space="preserve">DEPLOYER</w:t>
+      </w:r>
+      <w:r>
+        <w:t xml:space="preserve"> </w:t>
+      </w:r>
+      <w:r>
+        <w:t xml:space="preserve">- Empresa que usa ChatGPT Enterprise sin customizar →</w:t>
+      </w:r>
+      <w:r>
+        <w:t xml:space="preserve"> </w:t>
+      </w:r>
+      <w:r>
+        <w:rPr>
+          <w:bCs/>
+          <w:b/>
+        </w:rPr>
+        <w:t xml:space="preserve">DEPLOYER</w:t>
+      </w:r>
+    </w:p>
+    <w:p>
+      <w:pPr>
+        <w:pStyle w:val="BodyText"/>
+      </w:pPr>
+      <w:r>
+        <w:rPr>
+          <w:bCs/>
+          <w:b/>
+        </w:rPr>
+        <w:t xml:space="preserve">REGLA GENERAL:</w:t>
+      </w:r>
+      <w:r>
+        <w:t xml:space="preserve"> </w:t>
+      </w:r>
+      <w:r>
+        <w:t xml:space="preserve">Si desarrollas para clientes →</w:t>
+      </w:r>
+      <w:r>
+        <w:t xml:space="preserve"> </w:t>
+      </w:r>
+      <w:r>
+        <w:rPr>
+          <w:bCs/>
+          <w:b/>
+        </w:rPr>
+        <w:t xml:space="preserve">PROVEEDOR</w:t>
+      </w:r>
+      <w:r>
+        <w:t xml:space="preserve"> </w:t>
+      </w:r>
+      <w:r>
+        <w:t xml:space="preserve">(mayoría de casos).</w:t>
+      </w:r>
+    </w:p>
+    <w:p>
+      <w:r>
+        <w:pict>
+          <v:rect style="width:0;height:1.5pt" o:hralign="center" o:hrstd="t" o:hr="t"/>
+        </w:pict>
+      </w:r>
+    </w:p>
+    <w:bookmarkEnd w:id="35"/>
+    <w:bookmarkEnd w:id="36"/>
+    <w:bookmarkStart w:id="40" w:name="mensajes-clave-comerciales"/>
+    <w:p>
+      <w:pPr>
+        <w:pStyle w:val="Heading2"/>
+      </w:pPr>
+      <w:r>
+        <w:t xml:space="preserve">🚨 MENSAJES CLAVE COMERCIALES</w:t>
+      </w:r>
+    </w:p>
+    <w:bookmarkStart w:id="37" w:name="para-ctos-consultoras-tech"/>
+    <w:p>
+      <w:pPr>
+        <w:pStyle w:val="Heading3"/>
+      </w:pPr>
+      <w:r>
+        <w:rPr>
+          <w:bCs/>
+          <w:b/>
+        </w:rPr>
+        <w:t xml:space="preserve">Para CTOs Consultoras Tech:</w:t>
+      </w:r>
+    </w:p>
+    <w:p>
+      <w:pPr>
+        <w:pStyle w:val="BlockText"/>
+      </w:pPr>
+      <w:r>
+        <w:t xml:space="preserve">“</w:t>
+      </w:r>
+      <w:r>
+        <w:t xml:space="preserve">¿Recomendáis a clientes usar adapters (LoRA) sobre Llama?</w:t>
+      </w:r>
+      <w:r>
+        <w:br/>
+      </w:r>
+      <w:r>
+        <w:t xml:space="preserve">✅ SÍ, pero sabiendo que:</w:t>
+      </w:r>
+      <w:r>
+        <w:t xml:space="preserve"> </w:t>
+      </w:r>
+      <w:r>
+        <w:t xml:space="preserve">1. Son proveedores GPAI (Art. 53) desde 2 agosto 2025 (9 meses)</w:t>
+      </w:r>
+      <w:r>
+        <w:t xml:space="preserve"> </w:t>
+      </w:r>
+      <w:r>
+        <w:t xml:space="preserve">2. Necesitan governance adapters desde día 1</w:t>
+      </w:r>
+      <w:r>
+        <w:t xml:space="preserve"> </w:t>
+      </w:r>
+      <w:r>
+        <w:t xml:space="preserve">3. CodeflowX es la ÚNICA plataforma que gobierna esto</w:t>
+      </w:r>
+      <w:r>
+        <w:t xml:space="preserve">”</w:t>
+      </w:r>
+    </w:p>
+    <w:p>
+      <w:r>
+        <w:pict>
+          <v:rect style="width:0;height:1.5pt" o:hralign="center" o:hrstd="t" o:hr="t"/>
+        </w:pict>
+      </w:r>
+    </w:p>
+    <w:bookmarkEnd w:id="37"/>
+    <w:bookmarkStart w:id="38" w:name="para-agencias-marketing"/>
+    <w:p>
+      <w:pPr>
+        <w:pStyle w:val="Heading3"/>
+      </w:pPr>
+      <w:r>
+        <w:rPr>
+          <w:bCs/>
+          <w:b/>
+        </w:rPr>
+        <w:t xml:space="preserve">Para Agencias Marketing:</w:t>
+      </w:r>
+    </w:p>
+    <w:p>
+      <w:pPr>
+        <w:pStyle w:val="BlockText"/>
+      </w:pPr>
+      <w:r>
+        <w:t xml:space="preserve">“¿Tu cliente usa chatbot con GPT-4 en su web?</w:t>
+      </w:r>
+      <w:r>
+        <w:br/>
+      </w:r>
+      <w:r>
+        <w:t xml:space="preserve">✅ Te afecta:</w:t>
+      </w:r>
+      <w:r>
+        <w:t xml:space="preserve"> </w:t>
+      </w:r>
+      <w:r>
+        <w:t xml:space="preserve">- Art. 52: Transparencia (usuario sabe que es IA)</w:t>
+      </w:r>
+      <w:r>
+        <w:t xml:space="preserve"> </w:t>
+      </w:r>
+      <w:r>
+        <w:t xml:space="preserve">- Art. 19: Logs conversaciones (auditable)</w:t>
+      </w:r>
+      <w:r>
+        <w:t xml:space="preserve"> </w:t>
+      </w:r>
+      <w:r>
+        <w:t xml:space="preserve">- Si vende productos financieros → Alto riesgo (Art. 6-27)</w:t>
+      </w:r>
+    </w:p>
+    <w:p>
+      <w:pPr>
+        <w:pStyle w:val="BlockText"/>
+      </w:pPr>
+      <w:r>
+        <w:t xml:space="preserve">CodeflowX automatiza compliance, tú solo vendes.”</w:t>
+      </w:r>
+    </w:p>
+    <w:p>
+      <w:r>
+        <w:pict>
+          <v:rect style="width:0;height:1.5pt" o:hralign="center" o:hrstd="t" o:hr="t"/>
+        </w:pict>
+      </w:r>
+    </w:p>
+    <w:bookmarkEnd w:id="38"/>
+    <w:bookmarkStart w:id="39" w:name="para-abogadoscompliance"/>
+    <w:p>
+      <w:pPr>
+        <w:pStyle w:val="Heading3"/>
+      </w:pPr>
+      <w:r>
+        <w:rPr>
+          <w:bCs/>
+          <w:b/>
+        </w:rPr>
+        <w:t xml:space="preserve">Para Abogados/Compliance:</w:t>
+      </w:r>
+    </w:p>
+    <w:p>
+      <w:pPr>
+        <w:pStyle w:val="BlockText"/>
+      </w:pPr>
+      <w:r>
+        <w:t xml:space="preserve">“Cliente hace fine-tuning de Llama con docs legales:</w:t>
+      </w:r>
+      <w:r>
+        <w:br/>
+      </w:r>
+      <w:r>
+        <w:t xml:space="preserve">1. Proveedor GPAI (Art. 53) → Deadline 2 agosto 2025</w:t>
+      </w:r>
+      <w:r>
+        <w:t xml:space="preserve"> </w:t>
+      </w:r>
+      <w:r>
+        <w:t xml:space="preserve">2. Sistema alto riesgo legal (Anexo III.8.a) → Deadline 2 agosto 2027</w:t>
+      </w:r>
+      <w:r>
+        <w:t xml:space="preserve"> </w:t>
+      </w:r>
+      <w:r>
+        <w:t xml:space="preserve">3.</w:t>
+      </w:r>
+      <w:r>
+        <w:t xml:space="preserve"> </w:t>
+      </w:r>
+      <w:r>
+        <w:rPr>
+          <w:bCs/>
+          <w:b/>
+        </w:rPr>
+        <w:t xml:space="preserve">Doble obligación, doble riesgo</w:t>
+      </w:r>
+    </w:p>
+    <w:p>
+      <w:pPr>
+        <w:pStyle w:val="BlockText"/>
+      </w:pPr>
+      <w:r>
+        <w:t xml:space="preserve">CodeflowX cubre ambas (único en mercado).”</w:t>
+      </w:r>
+    </w:p>
+    <w:p>
+      <w:r>
+        <w:pict>
+          <v:rect style="width:0;height:1.5pt" o:hralign="center" o:hrstd="t" o:hr="t"/>
+        </w:pict>
+      </w:r>
+    </w:p>
+    <w:bookmarkEnd w:id="39"/>
+    <w:bookmarkEnd w:id="40"/>
+    <w:bookmarkStart w:id="44" w:name="priorización-por-urgencia"/>
+    <w:p>
+      <w:pPr>
+        <w:pStyle w:val="Heading2"/>
+      </w:pPr>
+      <w:r>
+        <w:t xml:space="preserve">📊 PRIORIZACIÓN POR URGENCIA</w:t>
+      </w:r>
+    </w:p>
+    <w:bookmarkStart w:id="41" w:name="urgente-2-agosto-2025---9-meses"/>
+    <w:p>
+      <w:pPr>
+        <w:pStyle w:val="Heading3"/>
+      </w:pPr>
+      <w:r>
+        <w:rPr>
+          <w:bCs/>
+          <w:b/>
+        </w:rPr>
+        <w:t xml:space="preserve">URGENTE (2 agosto 2025 - 9 meses):</w:t>
+      </w:r>
+    </w:p>
+    <w:p>
+      <w:pPr>
+        <w:pStyle w:val="FirstParagraph"/>
+      </w:pPr>
+      <w:r>
+        <w:t xml:space="preserve">Si haces</w:t>
+      </w:r>
+      <w:r>
+        <w:t xml:space="preserve"> </w:t>
+      </w:r>
+      <w:r>
+        <w:rPr>
+          <w:bCs/>
+          <w:b/>
+        </w:rPr>
+        <w:t xml:space="preserve">CUALQUIERA</w:t>
+      </w:r>
+      <w:r>
+        <w:t xml:space="preserve"> </w:t>
+      </w:r>
+      <w:r>
+        <w:t xml:space="preserve">de esto:</w:t>
+      </w:r>
+      <w:r>
+        <w:t xml:space="preserve"> </w:t>
+      </w:r>
+      <w:r>
+        <w:t xml:space="preserve">- ✅ Fine-tuning modelos</w:t>
+      </w:r>
+      <w:r>
+        <w:t xml:space="preserve"> </w:t>
+      </w:r>
+      <w:r>
+        <w:t xml:space="preserve">- ✅ Adapters (LoRA, QLoRA, etc.)</w:t>
+      </w:r>
+      <w:r>
+        <w:t xml:space="preserve"> </w:t>
+      </w:r>
+      <w:r>
+        <w:t xml:space="preserve">- ✅ Merge de modelos</w:t>
+      </w:r>
+      <w:r>
+        <w:t xml:space="preserve"> </w:t>
+      </w:r>
+      <w:r>
+        <w:t xml:space="preserve">- ✅ Distribución modelos cuantizados</w:t>
+      </w:r>
+    </w:p>
+    <w:p>
+      <w:pPr>
+        <w:pStyle w:val="BodyText"/>
+      </w:pPr>
+      <w:r>
+        <w:t xml:space="preserve">→</w:t>
+      </w:r>
+      <w:r>
+        <w:t xml:space="preserve"> </w:t>
+      </w:r>
+      <w:r>
+        <w:rPr>
+          <w:bCs/>
+          <w:b/>
+        </w:rPr>
+        <w:t xml:space="preserve">ERES PROVEEDOR GPAI</w:t>
+      </w:r>
+      <w:r>
+        <w:t xml:space="preserve"> </w:t>
+      </w:r>
+      <w:r>
+        <w:t xml:space="preserve">→ Art. 53 + Anexo XI + Anexo XII</w:t>
+      </w:r>
+    </w:p>
+    <w:p>
+      <w:r>
+        <w:pict>
+          <v:rect style="width:0;height:1.5pt" o:hralign="center" o:hrstd="t" o:hr="t"/>
+        </w:pict>
+      </w:r>
+    </w:p>
+    <w:bookmarkEnd w:id="41"/>
+    <w:bookmarkStart w:id="42" w:name="importante-2-agosto-2026---21-meses"/>
+    <w:p>
+      <w:pPr>
+        <w:pStyle w:val="Heading3"/>
+      </w:pPr>
+      <w:r>
+        <w:rPr>
+          <w:bCs/>
+          <w:b/>
+        </w:rPr>
+        <w:t xml:space="preserve">IMPORTANTE (2 agosto 2026 - 21 meses):</w:t>
+      </w:r>
+    </w:p>
+    <w:p>
+      <w:pPr>
+        <w:pStyle w:val="FirstParagraph"/>
+      </w:pPr>
+      <w:r>
+        <w:t xml:space="preserve">Aplicación general:</w:t>
+      </w:r>
+      <w:r>
+        <w:t xml:space="preserve"> </w:t>
+      </w:r>
+      <w:r>
+        <w:t xml:space="preserve">- ✅ Chatbots (Art. 52 transparencia mínimo)</w:t>
+      </w:r>
+      <w:r>
+        <w:t xml:space="preserve"> </w:t>
+      </w:r>
+      <w:r>
+        <w:t xml:space="preserve">- ✅ Sistemas IA no alto riesgo</w:t>
+      </w:r>
+      <w:r>
+        <w:t xml:space="preserve"> </w:t>
+      </w:r>
+      <w:r>
+        <w:t xml:space="preserve">- ✅ Contenido generado por IA</w:t>
+      </w:r>
+    </w:p>
+    <w:p>
+      <w:r>
+        <w:pict>
+          <v:rect style="width:0;height:1.5pt" o:hralign="center" o:hrstd="t" o:hr="t"/>
+        </w:pict>
+      </w:r>
+    </w:p>
+    <w:bookmarkEnd w:id="42"/>
+    <w:bookmarkStart w:id="43" w:name="Xb1d57399391dc06963dfac7a80f62206234b32c"/>
+    <w:p>
+      <w:pPr>
+        <w:pStyle w:val="Heading3"/>
+      </w:pPr>
+      <w:r>
+        <w:rPr>
+          <w:bCs/>
+          <w:b/>
+        </w:rPr>
+        <w:t xml:space="preserve">CRÍTICO SECTORES REGULADOS (2 agosto 2027 - 32 meses):</w:t>
+      </w:r>
+    </w:p>
+    <w:p>
+      <w:pPr>
+        <w:pStyle w:val="FirstParagraph"/>
+      </w:pPr>
+      <w:r>
+        <w:t xml:space="preserve">Sistemas alto riesgo (Anexo III):</w:t>
+      </w:r>
+      <w:r>
+        <w:t xml:space="preserve"> </w:t>
+      </w:r>
+      <w:r>
+        <w:t xml:space="preserve">- ✅ RRHH (screening CVs, evaluación desempeño)</w:t>
+      </w:r>
+      <w:r>
+        <w:t xml:space="preserve"> </w:t>
+      </w:r>
+      <w:r>
+        <w:t xml:space="preserve">- ✅ Financiero (scoring crediticio, seguros)</w:t>
+      </w:r>
+      <w:r>
+        <w:t xml:space="preserve"> </w:t>
+      </w:r>
+      <w:r>
+        <w:t xml:space="preserve">- ✅ Salud (diagnóstico, análisis imágenes)</w:t>
+      </w:r>
+      <w:r>
+        <w:t xml:space="preserve"> </w:t>
+      </w:r>
+      <w:r>
+        <w:t xml:space="preserve">- ✅ Legal (sistemas decisión judicial)</w:t>
+      </w:r>
+      <w:r>
+        <w:t xml:space="preserve"> </w:t>
+      </w:r>
+      <w:r>
+        <w:t xml:space="preserve">- ✅ Público (administración, servicios esenciales)</w:t>
+      </w:r>
+    </w:p>
+    <w:p>
+      <w:pPr>
+        <w:pStyle w:val="BodyText"/>
+      </w:pPr>
+      <w:r>
+        <w:t xml:space="preserve">→</w:t>
+      </w:r>
+      <w:r>
+        <w:t xml:space="preserve"> </w:t>
+      </w:r>
+      <w:r>
+        <w:rPr>
+          <w:bCs/>
+          <w:b/>
+        </w:rPr>
+        <w:t xml:space="preserve">Art. 6-27 COMPLETO</w:t>
+      </w:r>
+    </w:p>
+    <w:p>
+      <w:r>
+        <w:pict>
+          <v:rect style="width:0;height:1.5pt" o:hralign="center" o:hrstd="t" o:hr="t"/>
+        </w:pict>
+      </w:r>
+    </w:p>
+    <w:bookmarkEnd w:id="43"/>
+    <w:bookmarkEnd w:id="44"/>
+    <w:bookmarkStart w:id="45" w:name="diferenciador-codeflowx"/>
+    <w:p>
+      <w:pPr>
+        <w:pStyle w:val="Heading2"/>
+      </w:pPr>
+      <w:r>
+        <w:t xml:space="preserve">💡 DIFERENCIADOR CODEFLOWX</w:t>
+      </w:r>
+    </w:p>
+    <w:p>
+      <w:pPr>
+        <w:pStyle w:val="FirstParagraph"/>
+      </w:pPr>
+      <w:r>
+        <w:rPr>
+          <w:bCs/>
+          <w:b/>
+        </w:rPr>
+        <w:t xml:space="preserve">Competencia (herramientas observabilidad):</w:t>
+      </w:r>
+      <w:r>
+        <w:t xml:space="preserve"> </w:t>
+      </w:r>
+      <w:r>
+        <w:t xml:space="preserve">- ❌ NO gobierna adapters</w:t>
+      </w:r>
+      <w:r>
+        <w:t xml:space="preserve"> </w:t>
+      </w:r>
+      <w:r>
+        <w:t xml:space="preserve">- ❌ NO gobierna fine-tuning</w:t>
+      </w:r>
+      <w:r>
+        <w:t xml:space="preserve"> </w:t>
+      </w:r>
+      <w:r>
+        <w:t xml:space="preserve">- ❌ NO gobierna merge modelos</w:t>
+      </w:r>
+      <w:r>
+        <w:t xml:space="preserve"> </w:t>
+      </w:r>
+      <w:r>
+        <w:t xml:space="preserve">- ❌ NO genera Anexo XI/XII</w:t>
+      </w:r>
+      <w:r>
+        <w:t xml:space="preserve"> </w:t>
+      </w:r>
+      <w:r>
+        <w:t xml:space="preserve">- ❌ NO tracking copyright compliance</w:t>
+      </w:r>
+    </w:p>
+    <w:p>
+      <w:pPr>
+        <w:pStyle w:val="BodyText"/>
+      </w:pPr>
+      <w:r>
+        <w:rPr>
+          <w:bCs/>
+          <w:b/>
+        </w:rPr>
+        <w:t xml:space="preserve">CodeflowX (governance completo):</w:t>
+      </w:r>
+      <w:r>
+        <w:t xml:space="preserve"> </w:t>
+      </w:r>
+      <w:r>
+        <w:t xml:space="preserve">- ✅ Gobierna adapters (versiones, evaluación, Anexo XI)</w:t>
+      </w:r>
+      <w:r>
+        <w:t xml:space="preserve"> </w:t>
+      </w:r>
+      <w:r>
+        <w:t xml:space="preserve">- ✅ Gobierna fine-tuning (datos, evaluación, Anexo XI)</w:t>
+      </w:r>
+      <w:r>
+        <w:t xml:space="preserve"> </w:t>
+      </w:r>
+      <w:r>
+        <w:t xml:space="preserve">- ✅ Gobierna merge (tracking origen, capacidades, Anexo XI)</w:t>
+      </w:r>
+      <w:r>
+        <w:t xml:space="preserve"> </w:t>
+      </w:r>
+      <w:r>
+        <w:t xml:space="preserve">- ✅ Auto-genera Anexo XI/XII (documentación técnica)</w:t>
+      </w:r>
+      <w:r>
+        <w:t xml:space="preserve"> </w:t>
+      </w:r>
+      <w:r>
+        <w:t xml:space="preserve">- ✅ Política copyright automatizada (Anexo XII)</w:t>
+      </w:r>
+      <w:r>
+        <w:t xml:space="preserve"> </w:t>
+      </w:r>
+      <w:r>
+        <w:t xml:space="preserve">- ✅ Governance modelos + prompts + agentes + RAG + datos</w:t>
+      </w:r>
+    </w:p>
+    <w:p>
+      <w:pPr>
+        <w:pStyle w:val="BodyText"/>
+      </w:pPr>
+      <w:r>
+        <w:rPr>
+          <w:bCs/>
+          <w:b/>
+        </w:rPr>
+        <w:t xml:space="preserve">ÚNICO en mercado con governance completo GPAI (Art. 53) + Sistemas Alto Riesgo (Art. 6-27).</w:t>
+      </w:r>
+    </w:p>
+    <w:p>
+      <w:r>
+        <w:pict>
+          <v:rect style="width:0;height:1.5pt" o:hralign="center" o:hrstd="t" o:hr="t"/>
+        </w:pict>
+      </w:r>
+    </w:p>
+    <w:bookmarkEnd w:id="45"/>
+    <w:bookmarkStart w:id="46" w:name="próximos-pasos"/>
+    <w:p>
+      <w:pPr>
+        <w:pStyle w:val="Heading2"/>
+      </w:pPr>
+      <w:r>
+        <w:t xml:space="preserve">📞 PRÓXIMOS PASOS</w:t>
+      </w:r>
+    </w:p>
+    <w:p>
+      <w:pPr>
+        <w:pStyle w:val="FirstParagraph"/>
+      </w:pPr>
+      <w:r>
+        <w:rPr>
+          <w:bCs/>
+          <w:b/>
+        </w:rPr>
+        <w:t xml:space="preserve">¿Tienes dudas sobre tu caso específico?</w:t>
+      </w:r>
+    </w:p>
+    <w:p>
+      <w:pPr>
+        <w:numPr>
+          <w:ilvl w:val="0"/>
+          <w:numId w:val="1007"/>
+        </w:numPr>
+        <w:pStyle w:val="Compact"/>
+      </w:pPr>
+      <w:r>
+        <w:rPr>
+          <w:bCs/>
+          <w:b/>
+        </w:rPr>
+        <w:t xml:space="preserve">Demo técnica 30 min:</w:t>
+      </w:r>
+      <w:r>
+        <w:t xml:space="preserve"> </w:t>
+      </w:r>
+      <w:r>
+        <w:t xml:space="preserve">Analizamos tu stack, te decimos qué obligaciones tienes</w:t>
+      </w:r>
+    </w:p>
+    <w:p>
+      <w:pPr>
+        <w:numPr>
+          <w:ilvl w:val="0"/>
+          <w:numId w:val="1007"/>
+        </w:numPr>
+        <w:pStyle w:val="Compact"/>
+      </w:pPr>
+      <w:r>
+        <w:rPr>
+          <w:bCs/>
+          <w:b/>
+        </w:rPr>
+        <w:t xml:space="preserve">Evaluación compliance:</w:t>
+      </w:r>
+      <w:r>
+        <w:t xml:space="preserve"> </w:t>
+      </w:r>
+      <w:r>
+        <w:t xml:space="preserve">Checklist personalizado según tu caso</w:t>
+      </w:r>
+    </w:p>
+    <w:p>
+      <w:pPr>
+        <w:numPr>
+          <w:ilvl w:val="0"/>
+          <w:numId w:val="1007"/>
+        </w:numPr>
+        <w:pStyle w:val="Compact"/>
+      </w:pPr>
+      <w:r>
+        <w:rPr>
+          <w:bCs/>
+          <w:b/>
+        </w:rPr>
+        <w:t xml:space="preserve">Roadmap implementación:</w:t>
+      </w:r>
+      <w:r>
+        <w:t xml:space="preserve"> </w:t>
+      </w:r>
+      <w:r>
+        <w:t xml:space="preserve">Plan paso a paso para cumplir deadlines</w:t>
+      </w:r>
+    </w:p>
+    <w:p>
+      <w:pPr>
+        <w:pStyle w:val="FirstParagraph"/>
+      </w:pPr>
+      <w:r>
+        <w:rPr>
+          <w:bCs/>
+          <w:b/>
+        </w:rPr>
+        <w:t xml:space="preserve">Contacto:</w:t>
+      </w:r>
+      <w:r>
+        <w:br/>
+      </w:r>
+      <w:r>
+        <w:t xml:space="preserve">Email: tech@codeflowx.com</w:t>
+      </w:r>
+      <w:r>
+        <w:br/>
+      </w:r>
+      <w:r>
+        <w:t xml:space="preserve">Calendly: [link]</w:t>
+      </w:r>
+    </w:p>
+    <w:p>
+      <w:r>
+        <w:pict>
+          <v:rect style="width:0;height:1.5pt" o:hralign="center" o:hrstd="t" o:hr="t"/>
+        </w:pict>
+      </w:r>
+    </w:p>
+    <w:p>
+      <w:pPr>
+        <w:pStyle w:val="FirstParagraph"/>
+      </w:pPr>
+      <w:r>
+        <w:rPr>
+          <w:bCs/>
+          <w:b/>
+        </w:rPr>
+        <w:t xml:space="preserve">CodeflowX - De España para Europa</w:t>
+      </w:r>
+      <w:r>
+        <w:br/>
+      </w:r>
+      <w:r>
+        <w:rPr>
+          <w:bCs/>
+          <w:b/>
+        </w:rPr>
+        <w:t xml:space="preserve">La única plataforma que gobierna adapters, fine-tuning, merge, RAG, agentes y prompts</w:t>
+      </w:r>
+      <w:r>
+        <w:br/>
+      </w:r>
+      <w:r>
+        <w:rPr>
+          <w:bCs/>
+          <w:b/>
+        </w:rPr>
+        <w:t xml:space="preserve">Compliance completo GPAI (Art. 53) + Alto Riesgo (Art. 6-27)</w:t>
+      </w:r>
+    </w:p>
+    <w:p>
+      <w:r>
+        <w:pict>
+          <v:rect style="width:0;height:1.5pt" o:hralign="center" o:hrstd="t" o:hr="t"/>
+        </w:pict>
+      </w:r>
+    </w:p>
     <w:p>
       <w:pPr>
         <w:pStyle w:val="FirstParagraph"/>
@@ -4158,8 +4457,8 @@
         <w:t xml:space="preserve">Fechas según Artículo 113 del Reglamento (UE) 2024/1689</w:t>
       </w:r>
     </w:p>
-    <w:bookmarkEnd w:id="42"/>
-    <w:bookmarkEnd w:id="43"/>
+    <w:bookmarkEnd w:id="46"/>
+    <w:bookmarkEnd w:id="47"/>
     <w:sectPr/>
   </w:body>
 </w:document>
@@ -4440,6 +4739,15 @@
     <w:abstractNumId w:val="991"/>
   </w:num>
   <w:num w:numId="1004">
+    <w:abstractNumId w:val="991"/>
+  </w:num>
+  <w:num w:numId="1005">
+    <w:abstractNumId w:val="991"/>
+  </w:num>
+  <w:num w:numId="1006">
+    <w:abstractNumId w:val="991"/>
+  </w:num>
+  <w:num w:numId="1007">
     <w:abstractNumId w:val="99411"/>
     <w:lvlOverride w:ilvl="0">
       <w:startOverride w:val="1"/>

</xml_diff>